<commit_message>
edit reports for labs 4-5
add code fragments & conclusion
</commit_message>
<xml_diff>
--- a/reports/6301 Королева Федорова ЛР 5.docx
+++ b/reports/6301 Королева Федорова ЛР 5.docx
@@ -1052,6 +1052,817 @@
     <w:p>
       <w:pPr>
         <w:pStyle w:val="1-"/>
+        <w:rPr>
+          <w:lang w:val="en-US"/>
+        </w:rPr>
+      </w:pPr>
+      <w:r>
+        <w:t>Код</w:t>
+      </w:r>
+      <w:r>
+        <w:rPr>
+          <w:lang w:val="en-US"/>
+        </w:rPr>
+        <w:t xml:space="preserve"> </w:t>
+      </w:r>
+      <w:r>
+        <w:rPr>
+          <w:lang w:val="en-US"/>
+        </w:rPr>
+        <w:t>docker-</w:t>
+      </w:r>
+      <w:proofErr w:type="spellStart"/>
+      <w:r>
+        <w:rPr>
+          <w:lang w:val="en-US"/>
+        </w:rPr>
+        <w:t>compose.yml</w:t>
+      </w:r>
+      <w:proofErr w:type="spellEnd"/>
+      <w:r>
+        <w:rPr>
+          <w:lang w:val="en-US"/>
+        </w:rPr>
+        <w:t>:</w:t>
+      </w:r>
+    </w:p>
+    <w:p>
+      <w:pPr>
+        <w:pStyle w:val="1-"/>
+        <w:rPr>
+          <w:lang w:val="en-US"/>
+        </w:rPr>
+      </w:pPr>
+      <w:r>
+        <w:rPr>
+          <w:lang w:val="en-US"/>
+        </w:rPr>
+        <w:t>services:</w:t>
+      </w:r>
+    </w:p>
+    <w:p>
+      <w:pPr>
+        <w:pStyle w:val="1-"/>
+        <w:rPr>
+          <w:lang w:val="en-US"/>
+        </w:rPr>
+      </w:pPr>
+      <w:r>
+        <w:rPr>
+          <w:lang w:val="en-US"/>
+        </w:rPr>
+        <w:t xml:space="preserve">  </w:t>
+      </w:r>
+      <w:proofErr w:type="spellStart"/>
+      <w:r>
+        <w:rPr>
+          <w:lang w:val="en-US"/>
+        </w:rPr>
+        <w:t>db</w:t>
+      </w:r>
+      <w:proofErr w:type="spellEnd"/>
+      <w:r>
+        <w:rPr>
+          <w:lang w:val="en-US"/>
+        </w:rPr>
+        <w:t xml:space="preserve">: # </w:t>
+      </w:r>
+      <w:proofErr w:type="spellStart"/>
+      <w:r>
+        <w:rPr>
+          <w:lang w:val="en-US"/>
+        </w:rPr>
+        <w:t>Сервис</w:t>
+      </w:r>
+      <w:proofErr w:type="spellEnd"/>
+      <w:r>
+        <w:rPr>
+          <w:lang w:val="en-US"/>
+        </w:rPr>
+        <w:t xml:space="preserve"> </w:t>
+      </w:r>
+      <w:proofErr w:type="spellStart"/>
+      <w:r>
+        <w:rPr>
+          <w:lang w:val="en-US"/>
+        </w:rPr>
+        <w:t>базы</w:t>
+      </w:r>
+      <w:proofErr w:type="spellEnd"/>
+      <w:r>
+        <w:rPr>
+          <w:lang w:val="en-US"/>
+        </w:rPr>
+        <w:t xml:space="preserve"> </w:t>
+      </w:r>
+      <w:proofErr w:type="spellStart"/>
+      <w:r>
+        <w:rPr>
+          <w:lang w:val="en-US"/>
+        </w:rPr>
+        <w:t>данных</w:t>
+      </w:r>
+      <w:proofErr w:type="spellEnd"/>
+      <w:r>
+        <w:rPr>
+          <w:lang w:val="en-US"/>
+        </w:rPr>
+        <w:t xml:space="preserve"> PostgreSQL</w:t>
+      </w:r>
+    </w:p>
+    <w:p>
+      <w:pPr>
+        <w:pStyle w:val="1-"/>
+        <w:rPr>
+          <w:lang w:val="en-US"/>
+        </w:rPr>
+      </w:pPr>
+      <w:r>
+        <w:rPr>
+          <w:lang w:val="en-US"/>
+        </w:rPr>
+        <w:t xml:space="preserve">    image: </w:t>
+      </w:r>
+      <w:proofErr w:type="spellStart"/>
+      <w:proofErr w:type="gramStart"/>
+      <w:r>
+        <w:rPr>
+          <w:lang w:val="en-US"/>
+        </w:rPr>
+        <w:t>postgres:latest</w:t>
+      </w:r>
+      <w:proofErr w:type="spellEnd"/>
+      <w:proofErr w:type="gramEnd"/>
+    </w:p>
+    <w:p>
+      <w:pPr>
+        <w:pStyle w:val="1-"/>
+        <w:rPr>
+          <w:lang w:val="en-US"/>
+        </w:rPr>
+      </w:pPr>
+      <w:r>
+        <w:rPr>
+          <w:lang w:val="en-US"/>
+        </w:rPr>
+        <w:t xml:space="preserve">    </w:t>
+      </w:r>
+      <w:proofErr w:type="spellStart"/>
+      <w:r>
+        <w:rPr>
+          <w:lang w:val="en-US"/>
+        </w:rPr>
+        <w:t>container_name</w:t>
+      </w:r>
+      <w:proofErr w:type="spellEnd"/>
+      <w:r>
+        <w:rPr>
+          <w:lang w:val="en-US"/>
+        </w:rPr>
+        <w:t xml:space="preserve">: </w:t>
+      </w:r>
+      <w:proofErr w:type="spellStart"/>
+      <w:r>
+        <w:rPr>
+          <w:lang w:val="en-US"/>
+        </w:rPr>
+        <w:t>postgres_db</w:t>
+      </w:r>
+      <w:proofErr w:type="spellEnd"/>
+    </w:p>
+    <w:p>
+      <w:pPr>
+        <w:pStyle w:val="1-"/>
+        <w:rPr>
+          <w:lang w:val="en-US"/>
+        </w:rPr>
+      </w:pPr>
+      <w:r>
+        <w:rPr>
+          <w:lang w:val="en-US"/>
+        </w:rPr>
+        <w:t xml:space="preserve">    environment:</w:t>
+      </w:r>
+    </w:p>
+    <w:p>
+      <w:pPr>
+        <w:pStyle w:val="1-"/>
+        <w:rPr>
+          <w:lang w:val="en-US"/>
+        </w:rPr>
+      </w:pPr>
+      <w:r>
+        <w:rPr>
+          <w:lang w:val="en-US"/>
+        </w:rPr>
+        <w:t xml:space="preserve">      # </w:t>
+      </w:r>
+      <w:proofErr w:type="spellStart"/>
+      <w:r>
+        <w:rPr>
+          <w:lang w:val="en-US"/>
+        </w:rPr>
+        <w:t>переменные</w:t>
+      </w:r>
+      <w:proofErr w:type="spellEnd"/>
+      <w:r>
+        <w:rPr>
+          <w:lang w:val="en-US"/>
+        </w:rPr>
+        <w:t xml:space="preserve"> </w:t>
+      </w:r>
+      <w:proofErr w:type="spellStart"/>
+      <w:r>
+        <w:rPr>
+          <w:lang w:val="en-US"/>
+        </w:rPr>
+        <w:t>окружения</w:t>
+      </w:r>
+      <w:proofErr w:type="spellEnd"/>
+    </w:p>
+    <w:p>
+      <w:pPr>
+        <w:pStyle w:val="1-"/>
+        <w:rPr>
+          <w:lang w:val="en-US"/>
+        </w:rPr>
+      </w:pPr>
+      <w:r>
+        <w:rPr>
+          <w:lang w:val="en-US"/>
+        </w:rPr>
+        <w:t xml:space="preserve">      POSTGRES_DB: </w:t>
+      </w:r>
+      <w:proofErr w:type="spellStart"/>
+      <w:r>
+        <w:rPr>
+          <w:lang w:val="en-US"/>
+        </w:rPr>
+        <w:t>mydatabase</w:t>
+      </w:r>
+      <w:proofErr w:type="spellEnd"/>
+    </w:p>
+    <w:p>
+      <w:pPr>
+        <w:pStyle w:val="1-"/>
+        <w:rPr>
+          <w:lang w:val="en-US"/>
+        </w:rPr>
+      </w:pPr>
+      <w:r>
+        <w:rPr>
+          <w:lang w:val="en-US"/>
+        </w:rPr>
+        <w:t xml:space="preserve">      POSTGRES_USER: </w:t>
+      </w:r>
+      <w:proofErr w:type="spellStart"/>
+      <w:r>
+        <w:rPr>
+          <w:lang w:val="en-US"/>
+        </w:rPr>
+        <w:t>myuser</w:t>
+      </w:r>
+      <w:proofErr w:type="spellEnd"/>
+    </w:p>
+    <w:p>
+      <w:pPr>
+        <w:pStyle w:val="1-"/>
+        <w:rPr>
+          <w:lang w:val="en-US"/>
+        </w:rPr>
+      </w:pPr>
+      <w:r>
+        <w:rPr>
+          <w:lang w:val="en-US"/>
+        </w:rPr>
+        <w:t xml:space="preserve">      POSTGRES_PASSWORD: </w:t>
+      </w:r>
+      <w:proofErr w:type="spellStart"/>
+      <w:r>
+        <w:rPr>
+          <w:lang w:val="en-US"/>
+        </w:rPr>
+        <w:t>mypassword</w:t>
+      </w:r>
+      <w:proofErr w:type="spellEnd"/>
+    </w:p>
+    <w:p>
+      <w:pPr>
+        <w:pStyle w:val="1-"/>
+        <w:rPr>
+          <w:lang w:val="en-US"/>
+        </w:rPr>
+      </w:pPr>
+      <w:r>
+        <w:rPr>
+          <w:lang w:val="en-US"/>
+        </w:rPr>
+        <w:t xml:space="preserve">    volumes:</w:t>
+      </w:r>
+    </w:p>
+    <w:p>
+      <w:pPr>
+        <w:pStyle w:val="1-"/>
+        <w:rPr>
+          <w:lang w:val="en-US"/>
+        </w:rPr>
+      </w:pPr>
+      <w:r>
+        <w:rPr>
+          <w:lang w:val="en-US"/>
+        </w:rPr>
+        <w:t xml:space="preserve">      - </w:t>
+      </w:r>
+      <w:proofErr w:type="spellStart"/>
+      <w:r>
+        <w:rPr>
+          <w:lang w:val="en-US"/>
+        </w:rPr>
+        <w:t>postgres_data</w:t>
+      </w:r>
+      <w:proofErr w:type="spellEnd"/>
+      <w:r>
+        <w:rPr>
+          <w:lang w:val="en-US"/>
+        </w:rPr>
+        <w:t>:/var/lib/</w:t>
+      </w:r>
+      <w:proofErr w:type="spellStart"/>
+      <w:r>
+        <w:rPr>
+          <w:lang w:val="en-US"/>
+        </w:rPr>
+        <w:t>postgresql</w:t>
+      </w:r>
+      <w:proofErr w:type="spellEnd"/>
+      <w:r>
+        <w:rPr>
+          <w:lang w:val="en-US"/>
+        </w:rPr>
+        <w:t>/data</w:t>
+      </w:r>
+    </w:p>
+    <w:p>
+      <w:pPr>
+        <w:pStyle w:val="1-"/>
+      </w:pPr>
+      <w:r>
+        <w:rPr>
+          <w:lang w:val="en-US"/>
+        </w:rPr>
+        <w:t xml:space="preserve">    ports</w:t>
+      </w:r>
+      <w:r>
+        <w:t>:</w:t>
+      </w:r>
+    </w:p>
+    <w:p>
+      <w:pPr>
+        <w:pStyle w:val="1-"/>
+      </w:pPr>
+      <w:r>
+        <w:t xml:space="preserve">      - "5432:5432" # Проброс порта 5432 из контейнера на хост-машину</w:t>
+      </w:r>
+    </w:p>
+    <w:p>
+      <w:pPr>
+        <w:pStyle w:val="1-"/>
+      </w:pPr>
+    </w:p>
+    <w:p>
+      <w:pPr>
+        <w:pStyle w:val="1-"/>
+        <w:rPr>
+          <w:lang w:val="en-US"/>
+        </w:rPr>
+      </w:pPr>
+      <w:r>
+        <w:t xml:space="preserve">  </w:t>
+      </w:r>
+      <w:r>
+        <w:rPr>
+          <w:lang w:val="en-US"/>
+        </w:rPr>
+        <w:t>backend:</w:t>
+      </w:r>
+    </w:p>
+    <w:p>
+      <w:pPr>
+        <w:pStyle w:val="1-"/>
+        <w:rPr>
+          <w:lang w:val="en-US"/>
+        </w:rPr>
+      </w:pPr>
+      <w:r>
+        <w:rPr>
+          <w:lang w:val="en-US"/>
+        </w:rPr>
+        <w:lastRenderedPageBreak/>
+        <w:t xml:space="preserve">    build</w:t>
+      </w:r>
+      <w:proofErr w:type="gramStart"/>
+      <w:r>
+        <w:rPr>
+          <w:lang w:val="en-US"/>
+        </w:rPr>
+        <w:t>: .</w:t>
+      </w:r>
+      <w:proofErr w:type="gramEnd"/>
+      <w:r>
+        <w:rPr>
+          <w:lang w:val="en-US"/>
+        </w:rPr>
+        <w:t xml:space="preserve"> # </w:t>
+      </w:r>
+      <w:proofErr w:type="spellStart"/>
+      <w:r>
+        <w:rPr>
+          <w:lang w:val="en-US"/>
+        </w:rPr>
+        <w:t>Из</w:t>
+      </w:r>
+      <w:proofErr w:type="spellEnd"/>
+      <w:r>
+        <w:rPr>
+          <w:lang w:val="en-US"/>
+        </w:rPr>
+        <w:t xml:space="preserve"> </w:t>
+      </w:r>
+      <w:proofErr w:type="spellStart"/>
+      <w:r>
+        <w:rPr>
+          <w:lang w:val="en-US"/>
+        </w:rPr>
+        <w:t>докерфайла</w:t>
+      </w:r>
+      <w:proofErr w:type="spellEnd"/>
+    </w:p>
+    <w:p>
+      <w:pPr>
+        <w:pStyle w:val="1-"/>
+        <w:rPr>
+          <w:lang w:val="en-US"/>
+        </w:rPr>
+      </w:pPr>
+      <w:r>
+        <w:rPr>
+          <w:lang w:val="en-US"/>
+        </w:rPr>
+        <w:t xml:space="preserve">    </w:t>
+      </w:r>
+      <w:proofErr w:type="spellStart"/>
+      <w:r>
+        <w:rPr>
+          <w:lang w:val="en-US"/>
+        </w:rPr>
+        <w:t>container_name</w:t>
+      </w:r>
+      <w:proofErr w:type="spellEnd"/>
+      <w:r>
+        <w:rPr>
+          <w:lang w:val="en-US"/>
+        </w:rPr>
+        <w:t xml:space="preserve">: </w:t>
+      </w:r>
+      <w:proofErr w:type="spellStart"/>
+      <w:r>
+        <w:rPr>
+          <w:lang w:val="en-US"/>
+        </w:rPr>
+        <w:t>spring_app</w:t>
+      </w:r>
+      <w:proofErr w:type="spellEnd"/>
+    </w:p>
+    <w:p>
+      <w:pPr>
+        <w:pStyle w:val="1-"/>
+        <w:rPr>
+          <w:lang w:val="en-US"/>
+        </w:rPr>
+      </w:pPr>
+      <w:r>
+        <w:rPr>
+          <w:lang w:val="en-US"/>
+        </w:rPr>
+        <w:t xml:space="preserve">    ports:</w:t>
+      </w:r>
+    </w:p>
+    <w:p>
+      <w:pPr>
+        <w:pStyle w:val="1-"/>
+        <w:rPr>
+          <w:lang w:val="en-US"/>
+        </w:rPr>
+      </w:pPr>
+      <w:r>
+        <w:rPr>
+          <w:lang w:val="en-US"/>
+        </w:rPr>
+        <w:t xml:space="preserve">      - "8080:8080"</w:t>
+      </w:r>
+    </w:p>
+    <w:p>
+      <w:pPr>
+        <w:pStyle w:val="1-"/>
+        <w:rPr>
+          <w:lang w:val="en-US"/>
+        </w:rPr>
+      </w:pPr>
+      <w:r>
+        <w:rPr>
+          <w:lang w:val="en-US"/>
+        </w:rPr>
+        <w:t xml:space="preserve">    environment:</w:t>
+      </w:r>
+    </w:p>
+    <w:p>
+      <w:pPr>
+        <w:pStyle w:val="1-"/>
+        <w:rPr>
+          <w:lang w:val="en-US"/>
+        </w:rPr>
+      </w:pPr>
+      <w:r>
+        <w:rPr>
+          <w:lang w:val="en-US"/>
+        </w:rPr>
+        <w:t xml:space="preserve">      # </w:t>
+      </w:r>
+      <w:proofErr w:type="spellStart"/>
+      <w:r>
+        <w:rPr>
+          <w:lang w:val="en-US"/>
+        </w:rPr>
+        <w:t>переменные</w:t>
+      </w:r>
+      <w:proofErr w:type="spellEnd"/>
+      <w:r>
+        <w:rPr>
+          <w:lang w:val="en-US"/>
+        </w:rPr>
+        <w:t xml:space="preserve"> </w:t>
+      </w:r>
+      <w:proofErr w:type="spellStart"/>
+      <w:r>
+        <w:rPr>
+          <w:lang w:val="en-US"/>
+        </w:rPr>
+        <w:t>окружения</w:t>
+      </w:r>
+      <w:proofErr w:type="spellEnd"/>
+    </w:p>
+    <w:p>
+      <w:pPr>
+        <w:pStyle w:val="1-"/>
+        <w:rPr>
+          <w:lang w:val="en-US"/>
+        </w:rPr>
+      </w:pPr>
+      <w:r>
+        <w:rPr>
+          <w:lang w:val="en-US"/>
+        </w:rPr>
+        <w:t xml:space="preserve">      SPRING_DATASOURCE_URL: </w:t>
+      </w:r>
+      <w:proofErr w:type="spellStart"/>
+      <w:proofErr w:type="gramStart"/>
+      <w:r>
+        <w:rPr>
+          <w:lang w:val="en-US"/>
+        </w:rPr>
+        <w:t>jdbc:postgresql</w:t>
+      </w:r>
+      <w:proofErr w:type="spellEnd"/>
+      <w:r>
+        <w:rPr>
+          <w:lang w:val="en-US"/>
+        </w:rPr>
+        <w:t>://db:5432/</w:t>
+      </w:r>
+      <w:proofErr w:type="spellStart"/>
+      <w:r>
+        <w:rPr>
+          <w:lang w:val="en-US"/>
+        </w:rPr>
+        <w:t>mydatabase</w:t>
+      </w:r>
+      <w:proofErr w:type="spellEnd"/>
+      <w:proofErr w:type="gramEnd"/>
+      <w:r>
+        <w:rPr>
+          <w:lang w:val="en-US"/>
+        </w:rPr>
+        <w:t xml:space="preserve"> </w:t>
+      </w:r>
+    </w:p>
+    <w:p>
+      <w:pPr>
+        <w:pStyle w:val="1-"/>
+        <w:rPr>
+          <w:lang w:val="en-US"/>
+        </w:rPr>
+      </w:pPr>
+      <w:r>
+        <w:rPr>
+          <w:lang w:val="en-US"/>
+        </w:rPr>
+        <w:t xml:space="preserve">      SPRING_DATASOURCE_USERNAME: </w:t>
+      </w:r>
+      <w:proofErr w:type="spellStart"/>
+      <w:r>
+        <w:rPr>
+          <w:lang w:val="en-US"/>
+        </w:rPr>
+        <w:t>myuser</w:t>
+      </w:r>
+      <w:proofErr w:type="spellEnd"/>
+    </w:p>
+    <w:p>
+      <w:pPr>
+        <w:pStyle w:val="1-"/>
+        <w:rPr>
+          <w:lang w:val="en-US"/>
+        </w:rPr>
+      </w:pPr>
+      <w:r>
+        <w:rPr>
+          <w:lang w:val="en-US"/>
+        </w:rPr>
+        <w:t xml:space="preserve">      SPRING_DATASOURCE_PASSWORD: </w:t>
+      </w:r>
+      <w:proofErr w:type="spellStart"/>
+      <w:r>
+        <w:rPr>
+          <w:lang w:val="en-US"/>
+        </w:rPr>
+        <w:t>mypassword</w:t>
+      </w:r>
+      <w:proofErr w:type="spellEnd"/>
+    </w:p>
+    <w:p>
+      <w:pPr>
+        <w:pStyle w:val="1-"/>
+      </w:pPr>
+      <w:r>
+        <w:rPr>
+          <w:lang w:val="en-US"/>
+        </w:rPr>
+        <w:t xml:space="preserve">    depends</w:t>
+      </w:r>
+      <w:r>
+        <w:t>_</w:t>
+      </w:r>
+      <w:r>
+        <w:rPr>
+          <w:lang w:val="en-US"/>
+        </w:rPr>
+        <w:t>on</w:t>
+      </w:r>
+      <w:r>
+        <w:t>:</w:t>
+      </w:r>
+    </w:p>
+    <w:p>
+      <w:pPr>
+        <w:pStyle w:val="1-"/>
+      </w:pPr>
+      <w:r>
+        <w:t xml:space="preserve">      - </w:t>
+      </w:r>
+      <w:proofErr w:type="spellStart"/>
+      <w:r>
+        <w:rPr>
+          <w:lang w:val="en-US"/>
+        </w:rPr>
+        <w:t>db</w:t>
+      </w:r>
+      <w:proofErr w:type="spellEnd"/>
+      <w:r>
+        <w:t xml:space="preserve"> # контейнер </w:t>
+      </w:r>
+      <w:r>
+        <w:rPr>
+          <w:lang w:val="en-US"/>
+        </w:rPr>
+        <w:t>backend</w:t>
+      </w:r>
+      <w:r>
+        <w:t xml:space="preserve"> будет запускаться после запуска контейнера </w:t>
+      </w:r>
+      <w:proofErr w:type="spellStart"/>
+      <w:r>
+        <w:rPr>
+          <w:lang w:val="en-US"/>
+        </w:rPr>
+        <w:t>db</w:t>
+      </w:r>
+      <w:proofErr w:type="spellEnd"/>
+    </w:p>
+    <w:p>
+      <w:pPr>
+        <w:pStyle w:val="1-"/>
+      </w:pPr>
+    </w:p>
+    <w:p>
+      <w:pPr>
+        <w:pStyle w:val="1-"/>
+      </w:pPr>
+      <w:r>
+        <w:rPr>
+          <w:lang w:val="en-US"/>
+        </w:rPr>
+        <w:t>volumes</w:t>
+      </w:r>
+      <w:r>
+        <w:t>:</w:t>
+      </w:r>
+    </w:p>
+    <w:p>
+      <w:pPr>
+        <w:pStyle w:val="1-"/>
+      </w:pPr>
+      <w:r>
+        <w:t xml:space="preserve">  </w:t>
+      </w:r>
+      <w:proofErr w:type="spellStart"/>
+      <w:r>
+        <w:rPr>
+          <w:lang w:val="en-US"/>
+        </w:rPr>
+        <w:t>postgres</w:t>
+      </w:r>
+      <w:proofErr w:type="spellEnd"/>
+      <w:r>
+        <w:t>_</w:t>
+      </w:r>
+      <w:r>
+        <w:rPr>
+          <w:lang w:val="en-US"/>
+        </w:rPr>
+        <w:t>data</w:t>
+      </w:r>
+      <w:r>
+        <w:t>:</w:t>
+      </w:r>
+    </w:p>
+    <w:p>
+      <w:pPr>
+        <w:pStyle w:val="1-"/>
+        <w:rPr>
+          <w:lang w:val="en-US"/>
+        </w:rPr>
+      </w:pPr>
+      <w:r>
+        <w:t xml:space="preserve">    </w:t>
+      </w:r>
+      <w:r>
+        <w:rPr>
+          <w:lang w:val="en-US"/>
+        </w:rPr>
+        <w:t>external</w:t>
+      </w:r>
+      <w:r>
+        <w:t xml:space="preserve">: </w:t>
+      </w:r>
+      <w:r>
+        <w:rPr>
+          <w:lang w:val="en-US"/>
+        </w:rPr>
+        <w:t>true</w:t>
+      </w:r>
+      <w:r>
+        <w:t xml:space="preserve"> #</w:t>
+      </w:r>
+      <w:r>
+        <w:rPr>
+          <w:lang w:val="en-US"/>
+        </w:rPr>
+        <w:t>volume</w:t>
+      </w:r>
+      <w:r>
+        <w:t xml:space="preserve"> уже создан вне </w:t>
+      </w:r>
+      <w:r>
+        <w:rPr>
+          <w:lang w:val="en-US"/>
+        </w:rPr>
+        <w:t>compose</w:t>
+      </w:r>
+      <w:r>
+        <w:t xml:space="preserve"> и его не надо создавать заново</w:t>
+      </w:r>
+    </w:p>
+    <w:p>
+      <w:pPr>
+        <w:pStyle w:val="1-"/>
+        <w:rPr>
+          <w:lang w:val="en-US"/>
+        </w:rPr>
+      </w:pPr>
+    </w:p>
+    <w:p>
+      <w:pPr>
+        <w:pStyle w:val="1-"/>
       </w:pPr>
       <w:r>
         <w:t xml:space="preserve">Образ для контейнера </w:t>
@@ -1094,6 +1905,801 @@
         <w:pStyle w:val="1-"/>
       </w:pPr>
       <w:r>
+        <w:t>Код</w:t>
+      </w:r>
+      <w:r>
+        <w:rPr>
+          <w:lang w:val="en-US"/>
+        </w:rPr>
+        <w:t xml:space="preserve"> </w:t>
+      </w:r>
+      <w:proofErr w:type="spellStart"/>
+      <w:r>
+        <w:rPr>
+          <w:lang w:val="en-US"/>
+        </w:rPr>
+        <w:t>Dockerfile</w:t>
+      </w:r>
+      <w:proofErr w:type="spellEnd"/>
+      <w:r>
+        <w:rPr>
+          <w:lang w:val="en-US"/>
+        </w:rPr>
+        <w:t>:</w:t>
+      </w:r>
+    </w:p>
+    <w:p>
+      <w:pPr>
+        <w:pStyle w:val="1-"/>
+      </w:pPr>
+    </w:p>
+    <w:p>
+      <w:pPr>
+        <w:pStyle w:val="1-"/>
+        <w:rPr>
+          <w:lang w:val="en-US"/>
+        </w:rPr>
+      </w:pPr>
+      <w:r>
+        <w:rPr>
+          <w:lang w:val="en-US"/>
+        </w:rPr>
+        <w:t># ---</w:t>
+      </w:r>
+      <w:proofErr w:type="spellStart"/>
+      <w:r>
+        <w:rPr>
+          <w:lang w:val="en-US"/>
+        </w:rPr>
+        <w:t>Этап</w:t>
+      </w:r>
+      <w:proofErr w:type="spellEnd"/>
+      <w:r>
+        <w:rPr>
+          <w:lang w:val="en-US"/>
+        </w:rPr>
+        <w:t xml:space="preserve"> </w:t>
+      </w:r>
+      <w:proofErr w:type="spellStart"/>
+      <w:r>
+        <w:rPr>
+          <w:lang w:val="en-US"/>
+        </w:rPr>
+        <w:t>сборки</w:t>
+      </w:r>
+      <w:proofErr w:type="spellEnd"/>
+      <w:r>
+        <w:rPr>
+          <w:lang w:val="en-US"/>
+        </w:rPr>
+        <w:t>---</w:t>
+      </w:r>
+    </w:p>
+    <w:p>
+      <w:pPr>
+        <w:pStyle w:val="1-"/>
+        <w:rPr>
+          <w:lang w:val="en-US"/>
+        </w:rPr>
+      </w:pPr>
+      <w:r>
+        <w:rPr>
+          <w:lang w:val="en-US"/>
+        </w:rPr>
+        <w:t xml:space="preserve">FROM maven:3.8.4-openjdk-17 AS build </w:t>
+      </w:r>
+    </w:p>
+    <w:p>
+      <w:pPr>
+        <w:pStyle w:val="1-"/>
+      </w:pPr>
+      <w:r>
+        <w:t xml:space="preserve"># Используем официальный образ </w:t>
+      </w:r>
+      <w:r>
+        <w:rPr>
+          <w:lang w:val="en-US"/>
+        </w:rPr>
+        <w:t>Maven</w:t>
+      </w:r>
+      <w:r>
+        <w:t xml:space="preserve"> с </w:t>
+      </w:r>
+      <w:r>
+        <w:rPr>
+          <w:lang w:val="en-US"/>
+        </w:rPr>
+        <w:t>JDK</w:t>
+      </w:r>
+      <w:r>
+        <w:t xml:space="preserve"> 17 для сборки </w:t>
+      </w:r>
+      <w:r>
+        <w:rPr>
+          <w:lang w:val="en-US"/>
+        </w:rPr>
+        <w:t>Java</w:t>
+      </w:r>
+      <w:r>
+        <w:t>-приложения</w:t>
+      </w:r>
+    </w:p>
+    <w:p>
+      <w:pPr>
+        <w:pStyle w:val="1-"/>
+      </w:pPr>
+    </w:p>
+    <w:p>
+      <w:pPr>
+        <w:pStyle w:val="1-"/>
+      </w:pPr>
+      <w:r>
+        <w:rPr>
+          <w:lang w:val="en-US"/>
+        </w:rPr>
+        <w:t>WORKDIR</w:t>
+      </w:r>
+      <w:r>
+        <w:t xml:space="preserve"> /</w:t>
+      </w:r>
+      <w:r>
+        <w:rPr>
+          <w:lang w:val="en-US"/>
+        </w:rPr>
+        <w:t>app</w:t>
+      </w:r>
+    </w:p>
+    <w:p>
+      <w:pPr>
+        <w:pStyle w:val="1-"/>
+      </w:pPr>
+      <w:r>
+        <w:t># Устанавливаем рабочую директорию внутри контейнера в /</w:t>
+      </w:r>
+      <w:r>
+        <w:rPr>
+          <w:lang w:val="en-US"/>
+        </w:rPr>
+        <w:t>app</w:t>
+      </w:r>
+    </w:p>
+    <w:p>
+      <w:pPr>
+        <w:pStyle w:val="1-"/>
+      </w:pPr>
+    </w:p>
+    <w:p>
+      <w:pPr>
+        <w:pStyle w:val="1-"/>
+      </w:pPr>
+      <w:r>
+        <w:rPr>
+          <w:lang w:val="en-US"/>
+        </w:rPr>
+        <w:t>COPY</w:t>
+      </w:r>
+      <w:r>
+        <w:t xml:space="preserve"> </w:t>
+      </w:r>
+      <w:proofErr w:type="gramStart"/>
+      <w:r>
+        <w:rPr>
+          <w:lang w:val="en-US"/>
+        </w:rPr>
+        <w:t>pom</w:t>
+      </w:r>
+      <w:r>
+        <w:t>.</w:t>
+      </w:r>
+      <w:r>
+        <w:rPr>
+          <w:lang w:val="en-US"/>
+        </w:rPr>
+        <w:t>xml</w:t>
+      </w:r>
+      <w:r>
+        <w:t xml:space="preserve"> .</w:t>
+      </w:r>
+      <w:proofErr w:type="gramEnd"/>
+    </w:p>
+    <w:p>
+      <w:pPr>
+        <w:pStyle w:val="1-"/>
+      </w:pPr>
+      <w:r>
+        <w:t xml:space="preserve"># Копируем </w:t>
+      </w:r>
+      <w:r>
+        <w:rPr>
+          <w:lang w:val="en-US"/>
+        </w:rPr>
+        <w:t>pom</w:t>
+      </w:r>
+      <w:r>
+        <w:t>.</w:t>
+      </w:r>
+      <w:r>
+        <w:rPr>
+          <w:lang w:val="en-US"/>
+        </w:rPr>
+        <w:t>xml</w:t>
+      </w:r>
+      <w:r>
+        <w:t xml:space="preserve"> из проекта в контейнер</w:t>
+      </w:r>
+    </w:p>
+    <w:p>
+      <w:pPr>
+        <w:pStyle w:val="1-"/>
+      </w:pPr>
+    </w:p>
+    <w:p>
+      <w:pPr>
+        <w:pStyle w:val="1-"/>
+        <w:rPr>
+          <w:lang w:val="en-US"/>
+        </w:rPr>
+      </w:pPr>
+      <w:r>
+        <w:rPr>
+          <w:lang w:val="en-US"/>
+        </w:rPr>
+        <w:t xml:space="preserve">RUN </w:t>
+      </w:r>
+      <w:proofErr w:type="spellStart"/>
+      <w:r>
+        <w:rPr>
+          <w:lang w:val="en-US"/>
+        </w:rPr>
+        <w:t>mvn</w:t>
+      </w:r>
+      <w:proofErr w:type="spellEnd"/>
+      <w:r>
+        <w:rPr>
+          <w:lang w:val="en-US"/>
+        </w:rPr>
+        <w:t xml:space="preserve"> </w:t>
+      </w:r>
+      <w:proofErr w:type="spellStart"/>
+      <w:proofErr w:type="gramStart"/>
+      <w:r>
+        <w:rPr>
+          <w:lang w:val="en-US"/>
+        </w:rPr>
+        <w:t>dependency:go</w:t>
+      </w:r>
+      <w:proofErr w:type="gramEnd"/>
+      <w:r>
+        <w:rPr>
+          <w:lang w:val="en-US"/>
+        </w:rPr>
+        <w:t>-offline</w:t>
+      </w:r>
+      <w:proofErr w:type="spellEnd"/>
+    </w:p>
+    <w:p>
+      <w:pPr>
+        <w:pStyle w:val="1-"/>
+      </w:pPr>
+      <w:r>
+        <w:t xml:space="preserve"># Запускаем команду </w:t>
+      </w:r>
+      <w:r>
+        <w:rPr>
+          <w:lang w:val="en-US"/>
+        </w:rPr>
+        <w:t>Maven</w:t>
+      </w:r>
+      <w:r>
+        <w:t xml:space="preserve">, которая скачивает все зависимости заранее, </w:t>
+      </w:r>
+    </w:p>
+    <w:p>
+      <w:pPr>
+        <w:pStyle w:val="1-"/>
+      </w:pPr>
+      <w:r>
+        <w:t xml:space="preserve"># чтобы ускорить последующую сборку и использовать кеш </w:t>
+      </w:r>
+      <w:r>
+        <w:rPr>
+          <w:lang w:val="en-US"/>
+        </w:rPr>
+        <w:t>Docker</w:t>
+      </w:r>
+    </w:p>
+    <w:p>
+      <w:pPr>
+        <w:pStyle w:val="1-"/>
+      </w:pPr>
+    </w:p>
+    <w:p>
+      <w:pPr>
+        <w:pStyle w:val="1-"/>
+      </w:pPr>
+      <w:r>
+        <w:rPr>
+          <w:lang w:val="en-US"/>
+        </w:rPr>
+        <w:t>COPY</w:t>
+      </w:r>
+      <w:r>
+        <w:t xml:space="preserve"> </w:t>
+      </w:r>
+      <w:proofErr w:type="spellStart"/>
+      <w:proofErr w:type="gramStart"/>
+      <w:r>
+        <w:rPr>
+          <w:lang w:val="en-US"/>
+        </w:rPr>
+        <w:t>src</w:t>
+      </w:r>
+      <w:proofErr w:type="spellEnd"/>
+      <w:r>
+        <w:t xml:space="preserve"> .</w:t>
+      </w:r>
+      <w:proofErr w:type="gramEnd"/>
+      <w:r>
+        <w:t>/</w:t>
+      </w:r>
+      <w:proofErr w:type="spellStart"/>
+      <w:r>
+        <w:rPr>
+          <w:lang w:val="en-US"/>
+        </w:rPr>
+        <w:t>src</w:t>
+      </w:r>
+      <w:proofErr w:type="spellEnd"/>
+    </w:p>
+    <w:p>
+      <w:pPr>
+        <w:pStyle w:val="1-"/>
+      </w:pPr>
+      <w:r>
+        <w:t xml:space="preserve"># Копируем исходный код (папку </w:t>
+      </w:r>
+      <w:proofErr w:type="spellStart"/>
+      <w:r>
+        <w:rPr>
+          <w:lang w:val="en-US"/>
+        </w:rPr>
+        <w:t>src</w:t>
+      </w:r>
+      <w:proofErr w:type="spellEnd"/>
+      <w:r>
+        <w:t>) в контейнер в папку /</w:t>
+      </w:r>
+      <w:r>
+        <w:rPr>
+          <w:lang w:val="en-US"/>
+        </w:rPr>
+        <w:t>app</w:t>
+      </w:r>
+      <w:r>
+        <w:t>/</w:t>
+      </w:r>
+      <w:proofErr w:type="spellStart"/>
+      <w:r>
+        <w:rPr>
+          <w:lang w:val="en-US"/>
+        </w:rPr>
+        <w:t>src</w:t>
+      </w:r>
+      <w:proofErr w:type="spellEnd"/>
+    </w:p>
+    <w:p>
+      <w:pPr>
+        <w:pStyle w:val="1-"/>
+      </w:pPr>
+    </w:p>
+    <w:p>
+      <w:pPr>
+        <w:pStyle w:val="1-"/>
+      </w:pPr>
+      <w:r>
+        <w:rPr>
+          <w:lang w:val="en-US"/>
+        </w:rPr>
+        <w:t>RUN</w:t>
+      </w:r>
+      <w:r>
+        <w:t xml:space="preserve"> </w:t>
+      </w:r>
+      <w:proofErr w:type="spellStart"/>
+      <w:r>
+        <w:rPr>
+          <w:lang w:val="en-US"/>
+        </w:rPr>
+        <w:t>mvn</w:t>
+      </w:r>
+      <w:proofErr w:type="spellEnd"/>
+      <w:r>
+        <w:t xml:space="preserve"> </w:t>
+      </w:r>
+      <w:r>
+        <w:rPr>
+          <w:lang w:val="en-US"/>
+        </w:rPr>
+        <w:t>package</w:t>
+      </w:r>
+      <w:r>
+        <w:t xml:space="preserve"> -</w:t>
+      </w:r>
+      <w:proofErr w:type="spellStart"/>
+      <w:r>
+        <w:rPr>
+          <w:lang w:val="en-US"/>
+        </w:rPr>
+        <w:t>DskipTests</w:t>
+      </w:r>
+      <w:proofErr w:type="spellEnd"/>
+    </w:p>
+    <w:p>
+      <w:pPr>
+        <w:pStyle w:val="1-"/>
+      </w:pPr>
+      <w:r>
+        <w:t xml:space="preserve"># Запускаем сборку проекта </w:t>
+      </w:r>
+      <w:r>
+        <w:rPr>
+          <w:lang w:val="en-US"/>
+        </w:rPr>
+        <w:t>Maven</w:t>
+      </w:r>
+      <w:r>
+        <w:t xml:space="preserve">, создавая исполняемый </w:t>
+      </w:r>
+      <w:r>
+        <w:rPr>
+          <w:lang w:val="en-US"/>
+        </w:rPr>
+        <w:t>jar</w:t>
+      </w:r>
+      <w:r>
+        <w:t>-файл</w:t>
+      </w:r>
+    </w:p>
+    <w:p>
+      <w:pPr>
+        <w:pStyle w:val="1-"/>
+      </w:pPr>
+      <w:r>
+        <w:t># Опция -</w:t>
+      </w:r>
+      <w:proofErr w:type="spellStart"/>
+      <w:r>
+        <w:rPr>
+          <w:lang w:val="en-US"/>
+        </w:rPr>
+        <w:t>DskipTests</w:t>
+      </w:r>
+      <w:proofErr w:type="spellEnd"/>
+      <w:r>
+        <w:t xml:space="preserve"> пропускает запуск тестов</w:t>
+      </w:r>
+    </w:p>
+    <w:p>
+      <w:pPr>
+        <w:pStyle w:val="1-"/>
+      </w:pPr>
+      <w:r>
+        <w:t xml:space="preserve"># В результате в папке </w:t>
+      </w:r>
+      <w:r>
+        <w:rPr>
+          <w:lang w:val="en-US"/>
+        </w:rPr>
+        <w:t>target</w:t>
+      </w:r>
+      <w:r>
+        <w:t xml:space="preserve"> появится файл </w:t>
+      </w:r>
+      <w:r>
+        <w:rPr>
+          <w:lang w:val="en-US"/>
+        </w:rPr>
+        <w:t>jar</w:t>
+      </w:r>
+      <w:r>
+        <w:t xml:space="preserve"> </w:t>
+      </w:r>
+    </w:p>
+    <w:p>
+      <w:pPr>
+        <w:pStyle w:val="1-"/>
+      </w:pPr>
+    </w:p>
+    <w:p>
+      <w:pPr>
+        <w:pStyle w:val="1-"/>
+      </w:pPr>
+      <w:r>
+        <w:t># ---Финальный образ---</w:t>
+      </w:r>
+    </w:p>
+    <w:p>
+      <w:pPr>
+        <w:pStyle w:val="1-"/>
+      </w:pPr>
+      <w:r>
+        <w:rPr>
+          <w:lang w:val="en-US"/>
+        </w:rPr>
+        <w:t>FROM</w:t>
+      </w:r>
+      <w:r>
+        <w:t xml:space="preserve"> </w:t>
+      </w:r>
+      <w:proofErr w:type="spellStart"/>
+      <w:r>
+        <w:rPr>
+          <w:lang w:val="en-US"/>
+        </w:rPr>
+        <w:t>openjdk</w:t>
+      </w:r>
+      <w:proofErr w:type="spellEnd"/>
+      <w:r>
+        <w:t>:17-</w:t>
+      </w:r>
+      <w:proofErr w:type="spellStart"/>
+      <w:r>
+        <w:rPr>
+          <w:lang w:val="en-US"/>
+        </w:rPr>
+        <w:t>jdk</w:t>
+      </w:r>
+      <w:proofErr w:type="spellEnd"/>
+      <w:r>
+        <w:t>-</w:t>
+      </w:r>
+      <w:r>
+        <w:rPr>
+          <w:lang w:val="en-US"/>
+        </w:rPr>
+        <w:t>slim</w:t>
+      </w:r>
+    </w:p>
+    <w:p>
+      <w:pPr>
+        <w:pStyle w:val="1-"/>
+      </w:pPr>
+      <w:r>
+        <w:t xml:space="preserve"># Используем облегчённый официальный образ </w:t>
+      </w:r>
+      <w:r>
+        <w:rPr>
+          <w:lang w:val="en-US"/>
+        </w:rPr>
+        <w:t>OpenJDK</w:t>
+      </w:r>
+      <w:r>
+        <w:t xml:space="preserve"> 17</w:t>
+      </w:r>
+    </w:p>
+    <w:p>
+      <w:pPr>
+        <w:pStyle w:val="1-"/>
+      </w:pPr>
+    </w:p>
+    <w:p>
+      <w:pPr>
+        <w:pStyle w:val="1-"/>
+      </w:pPr>
+      <w:r>
+        <w:rPr>
+          <w:lang w:val="en-US"/>
+        </w:rPr>
+        <w:t>WORKDIR</w:t>
+      </w:r>
+      <w:r>
+        <w:t xml:space="preserve"> /</w:t>
+      </w:r>
+      <w:r>
+        <w:rPr>
+          <w:lang w:val="en-US"/>
+        </w:rPr>
+        <w:t>app</w:t>
+      </w:r>
+    </w:p>
+    <w:p>
+      <w:pPr>
+        <w:pStyle w:val="1-"/>
+      </w:pPr>
+      <w:r>
+        <w:t># Устанавливаем рабочую директорию в /</w:t>
+      </w:r>
+      <w:r>
+        <w:rPr>
+          <w:lang w:val="en-US"/>
+        </w:rPr>
+        <w:t>app</w:t>
+      </w:r>
+      <w:r>
+        <w:t xml:space="preserve"> внутри контейнера.</w:t>
+      </w:r>
+    </w:p>
+    <w:p>
+      <w:pPr>
+        <w:pStyle w:val="1-"/>
+      </w:pPr>
+    </w:p>
+    <w:p>
+      <w:pPr>
+        <w:pStyle w:val="1-"/>
+        <w:rPr>
+          <w:lang w:val="en-US"/>
+        </w:rPr>
+      </w:pPr>
+      <w:r>
+        <w:rPr>
+          <w:lang w:val="en-US"/>
+        </w:rPr>
+        <w:t>COPY --from=build /app/target/*.jar app.jar</w:t>
+      </w:r>
+    </w:p>
+    <w:p>
+      <w:pPr>
+        <w:pStyle w:val="1-"/>
+      </w:pPr>
+      <w:r>
+        <w:t xml:space="preserve"># Копируем собранный </w:t>
+      </w:r>
+      <w:r>
+        <w:rPr>
+          <w:lang w:val="en-US"/>
+        </w:rPr>
+        <w:t>JAR</w:t>
+      </w:r>
+      <w:r>
+        <w:t>-файл из предыдущего этапа сборки (</w:t>
+      </w:r>
+      <w:r>
+        <w:rPr>
+          <w:lang w:val="en-US"/>
+        </w:rPr>
+        <w:t>build</w:t>
+      </w:r>
+      <w:r>
+        <w:t>) из папки /</w:t>
+      </w:r>
+      <w:r>
+        <w:rPr>
+          <w:lang w:val="en-US"/>
+        </w:rPr>
+        <w:t>app</w:t>
+      </w:r>
+      <w:r>
+        <w:t>/</w:t>
+      </w:r>
+      <w:r>
+        <w:rPr>
+          <w:lang w:val="en-US"/>
+        </w:rPr>
+        <w:t>target</w:t>
+      </w:r>
+      <w:r>
+        <w:t xml:space="preserve"> в текущую рабочую директорию контейнера под именем </w:t>
+      </w:r>
+      <w:r>
+        <w:rPr>
+          <w:lang w:val="en-US"/>
+        </w:rPr>
+        <w:t>app</w:t>
+      </w:r>
+      <w:r>
+        <w:t>.</w:t>
+      </w:r>
+      <w:r>
+        <w:rPr>
+          <w:lang w:val="en-US"/>
+        </w:rPr>
+        <w:t>jar</w:t>
+      </w:r>
+      <w:r>
+        <w:t>.</w:t>
+      </w:r>
+    </w:p>
+    <w:p>
+      <w:pPr>
+        <w:pStyle w:val="1-"/>
+      </w:pPr>
+      <w:r>
+        <w:t xml:space="preserve"># Благодаря этому в финальном образе будет только готовый к запуску </w:t>
+      </w:r>
+      <w:r>
+        <w:rPr>
+          <w:lang w:val="en-US"/>
+        </w:rPr>
+        <w:t>JAR</w:t>
+      </w:r>
+      <w:r>
+        <w:t xml:space="preserve"> без исходников и </w:t>
+      </w:r>
+      <w:r>
+        <w:rPr>
+          <w:lang w:val="en-US"/>
+        </w:rPr>
+        <w:t>Maven</w:t>
+      </w:r>
+      <w:r>
+        <w:t>.</w:t>
+      </w:r>
+    </w:p>
+    <w:p>
+      <w:pPr>
+        <w:pStyle w:val="1-"/>
+      </w:pPr>
+    </w:p>
+    <w:p>
+      <w:pPr>
+        <w:pStyle w:val="1-"/>
+      </w:pPr>
+      <w:r>
+        <w:rPr>
+          <w:lang w:val="en-US"/>
+        </w:rPr>
+        <w:lastRenderedPageBreak/>
+        <w:t>EXPOSE</w:t>
+      </w:r>
+      <w:r>
+        <w:t xml:space="preserve"> 8080</w:t>
+      </w:r>
+    </w:p>
+    <w:p>
+      <w:pPr>
+        <w:pStyle w:val="1-"/>
+      </w:pPr>
+      <w:r>
+        <w:t xml:space="preserve"># Оповещаем </w:t>
+      </w:r>
+      <w:r>
+        <w:rPr>
+          <w:lang w:val="en-US"/>
+        </w:rPr>
+        <w:t>Docker</w:t>
+      </w:r>
+      <w:r>
+        <w:t>, что контейнер слушает порт 8080(это не пробрасывает порт наружу)</w:t>
+      </w:r>
+    </w:p>
+    <w:p>
+      <w:pPr>
+        <w:pStyle w:val="1-"/>
+      </w:pPr>
+    </w:p>
+    <w:p>
+      <w:pPr>
+        <w:pStyle w:val="1-"/>
+        <w:rPr>
+          <w:lang w:val="en-US"/>
+        </w:rPr>
+      </w:pPr>
+      <w:r>
+        <w:rPr>
+          <w:lang w:val="en-US"/>
+        </w:rPr>
+        <w:t>ENTRYPOINT ["java", "-jar", "app.jar"]</w:t>
+      </w:r>
+    </w:p>
+    <w:p>
+      <w:pPr>
+        <w:pStyle w:val="1-"/>
+      </w:pPr>
+      <w:r>
+        <w:t># Команда, которая будет выполнена при запуске контейнера</w:t>
+      </w:r>
+    </w:p>
+    <w:p>
+      <w:pPr>
+        <w:pStyle w:val="1-"/>
+      </w:pPr>
+    </w:p>
+    <w:p>
+      <w:pPr>
+        <w:pStyle w:val="1-"/>
+      </w:pPr>
+      <w:r>
         <w:t xml:space="preserve">На рисунках 1, 2, 3, 4 представлены скриншоты работы приложения из контейнеров, которые подтверждают корректную работу приложения из контейнеров </w:t>
       </w:r>
       <w:proofErr w:type="spellStart"/>
@@ -1121,7 +2727,6 @@
         <w:rPr>
           <w:noProof/>
         </w:rPr>
-        <w:lastRenderedPageBreak/>
         <w:drawing>
           <wp:inline distT="0" distB="0" distL="114300" distR="114300" wp14:anchorId="07A2B3CE" wp14:editId="07D89BDD">
             <wp:extent cx="5033010" cy="2831465"/>
@@ -1220,6 +2825,7 @@
         <w:rPr>
           <w:noProof/>
         </w:rPr>
+        <w:lastRenderedPageBreak/>
         <w:drawing>
           <wp:inline distT="0" distB="0" distL="114300" distR="114300" wp14:anchorId="1BE01F57" wp14:editId="001F0CF9">
             <wp:extent cx="5012690" cy="2820035"/>
@@ -1311,7 +2917,6 @@
         <w:rPr>
           <w:noProof/>
         </w:rPr>
-        <w:lastRenderedPageBreak/>
         <w:drawing>
           <wp:inline distT="0" distB="0" distL="114300" distR="114300" wp14:anchorId="4241610F" wp14:editId="6135438E">
             <wp:extent cx="4681220" cy="2633345"/>
@@ -1386,6 +2991,7 @@
         <w:rPr>
           <w:noProof/>
         </w:rPr>
+        <w:lastRenderedPageBreak/>
         <w:drawing>
           <wp:inline distT="0" distB="0" distL="114300" distR="114300" wp14:anchorId="536D9546" wp14:editId="2E046D7B">
             <wp:extent cx="4754245" cy="2674620"/>
@@ -1572,7 +3178,6 @@
           <w:szCs w:val="28"/>
           <w:lang w:eastAsia="ru-RU"/>
         </w:rPr>
-        <w:lastRenderedPageBreak/>
         <w:t>openapi</w:t>
       </w:r>
       <w:proofErr w:type="spellEnd"/>
@@ -1919,6 +3524,15 @@
           <w:lang w:eastAsia="ru-RU"/>
         </w:rPr>
         <w:br/>
+      </w:r>
+      <w:r>
+        <w:rPr>
+          <w:rFonts w:ascii="Times New Roman" w:eastAsiaTheme="minorEastAsia" w:hAnsi="Times New Roman" w:hint="default"/>
+          <w:sz w:val="28"/>
+          <w:szCs w:val="28"/>
+          <w:lang w:eastAsia="ru-RU"/>
+        </w:rPr>
+        <w:lastRenderedPageBreak/>
         <w:t xml:space="preserve">          required: false</w:t>
       </w:r>
       <w:r>
@@ -2451,15 +4065,6 @@
           <w:lang w:eastAsia="ru-RU"/>
         </w:rPr>
         <w:br/>
-      </w:r>
-      <w:r>
-        <w:rPr>
-          <w:rFonts w:ascii="Times New Roman" w:eastAsiaTheme="minorEastAsia" w:hAnsi="Times New Roman" w:hint="default"/>
-          <w:sz w:val="28"/>
-          <w:szCs w:val="28"/>
-          <w:lang w:eastAsia="ru-RU"/>
-        </w:rPr>
-        <w:lastRenderedPageBreak/>
         <w:t xml:space="preserve">              schema:</w:t>
       </w:r>
       <w:r>
@@ -2692,6 +4297,15 @@
           <w:lang w:eastAsia="ru-RU"/>
         </w:rPr>
         <w:br/>
+      </w:r>
+      <w:r>
+        <w:rPr>
+          <w:rFonts w:ascii="Times New Roman" w:eastAsiaTheme="minorEastAsia" w:hAnsi="Times New Roman" w:hint="default"/>
+          <w:sz w:val="28"/>
+          <w:szCs w:val="28"/>
+          <w:lang w:eastAsia="ru-RU"/>
+        </w:rPr>
+        <w:lastRenderedPageBreak/>
         <w:t xml:space="preserve">        "200":</w:t>
       </w:r>
       <w:r>
@@ -3156,6 +4770,392 @@
           <w:lang w:eastAsia="ru-RU"/>
         </w:rPr>
         <w:br/>
+        <w:t xml:space="preserve">    </w:t>
+      </w:r>
+      <w:proofErr w:type="spellStart"/>
+      <w:r>
+        <w:rPr>
+          <w:rFonts w:ascii="Times New Roman" w:eastAsiaTheme="minorEastAsia" w:hAnsi="Times New Roman" w:hint="default"/>
+          <w:sz w:val="28"/>
+          <w:szCs w:val="28"/>
+          <w:lang w:eastAsia="ru-RU"/>
+        </w:rPr>
+        <w:t>operationId</w:t>
+      </w:r>
+      <w:proofErr w:type="spellEnd"/>
+      <w:r>
+        <w:rPr>
+          <w:rFonts w:ascii="Times New Roman" w:eastAsiaTheme="minorEastAsia" w:hAnsi="Times New Roman" w:hint="default"/>
+          <w:sz w:val="28"/>
+          <w:szCs w:val="28"/>
+          <w:lang w:eastAsia="ru-RU"/>
+        </w:rPr>
+        <w:t>: "</w:t>
+      </w:r>
+      <w:proofErr w:type="spellStart"/>
+      <w:r>
+        <w:rPr>
+          <w:rFonts w:ascii="Times New Roman" w:eastAsiaTheme="minorEastAsia" w:hAnsi="Times New Roman" w:hint="default"/>
+          <w:sz w:val="28"/>
+          <w:szCs w:val="28"/>
+          <w:lang w:eastAsia="ru-RU"/>
+        </w:rPr>
+        <w:t>getRecipesForCurrentUser</w:t>
+      </w:r>
+      <w:proofErr w:type="spellEnd"/>
+      <w:r>
+        <w:rPr>
+          <w:rFonts w:ascii="Times New Roman" w:eastAsiaTheme="minorEastAsia" w:hAnsi="Times New Roman" w:hint="default"/>
+          <w:sz w:val="28"/>
+          <w:szCs w:val="28"/>
+          <w:lang w:eastAsia="ru-RU"/>
+        </w:rPr>
+        <w:t>"</w:t>
+      </w:r>
+      <w:r>
+        <w:rPr>
+          <w:rFonts w:ascii="Times New Roman" w:eastAsiaTheme="minorEastAsia" w:hAnsi="Times New Roman" w:hint="default"/>
+          <w:sz w:val="28"/>
+          <w:szCs w:val="28"/>
+          <w:lang w:eastAsia="ru-RU"/>
+        </w:rPr>
+        <w:br/>
+        <w:t xml:space="preserve">    parameters:</w:t>
+      </w:r>
+      <w:r>
+        <w:rPr>
+          <w:rFonts w:ascii="Times New Roman" w:eastAsiaTheme="minorEastAsia" w:hAnsi="Times New Roman" w:hint="default"/>
+          <w:sz w:val="28"/>
+          <w:szCs w:val="28"/>
+          <w:lang w:eastAsia="ru-RU"/>
+        </w:rPr>
+        <w:br/>
+        <w:t xml:space="preserve">    - name: "</w:t>
+      </w:r>
+      <w:proofErr w:type="spellStart"/>
+      <w:r>
+        <w:rPr>
+          <w:rFonts w:ascii="Times New Roman" w:eastAsiaTheme="minorEastAsia" w:hAnsi="Times New Roman" w:hint="default"/>
+          <w:sz w:val="28"/>
+          <w:szCs w:val="28"/>
+          <w:lang w:eastAsia="ru-RU"/>
+        </w:rPr>
+        <w:t>recipeCategory</w:t>
+      </w:r>
+      <w:proofErr w:type="spellEnd"/>
+      <w:r>
+        <w:rPr>
+          <w:rFonts w:ascii="Times New Roman" w:eastAsiaTheme="minorEastAsia" w:hAnsi="Times New Roman" w:hint="default"/>
+          <w:sz w:val="28"/>
+          <w:szCs w:val="28"/>
+          <w:lang w:eastAsia="ru-RU"/>
+        </w:rPr>
+        <w:t>"</w:t>
+      </w:r>
+      <w:r>
+        <w:rPr>
+          <w:rFonts w:ascii="Times New Roman" w:eastAsiaTheme="minorEastAsia" w:hAnsi="Times New Roman" w:hint="default"/>
+          <w:sz w:val="28"/>
+          <w:szCs w:val="28"/>
+          <w:lang w:eastAsia="ru-RU"/>
+        </w:rPr>
+        <w:br/>
+        <w:t xml:space="preserve">      in: "query"</w:t>
+      </w:r>
+      <w:r>
+        <w:rPr>
+          <w:rFonts w:ascii="Times New Roman" w:eastAsiaTheme="minorEastAsia" w:hAnsi="Times New Roman" w:hint="default"/>
+          <w:sz w:val="28"/>
+          <w:szCs w:val="28"/>
+          <w:lang w:eastAsia="ru-RU"/>
+        </w:rPr>
+        <w:br/>
+        <w:t xml:space="preserve">      required: false</w:t>
+      </w:r>
+      <w:r>
+        <w:rPr>
+          <w:rFonts w:ascii="Times New Roman" w:eastAsiaTheme="minorEastAsia" w:hAnsi="Times New Roman" w:hint="default"/>
+          <w:sz w:val="28"/>
+          <w:szCs w:val="28"/>
+          <w:lang w:eastAsia="ru-RU"/>
+        </w:rPr>
+        <w:br/>
+        <w:t xml:space="preserve">      schema:</w:t>
+      </w:r>
+      <w:r>
+        <w:rPr>
+          <w:rFonts w:ascii="Times New Roman" w:eastAsiaTheme="minorEastAsia" w:hAnsi="Times New Roman" w:hint="default"/>
+          <w:sz w:val="28"/>
+          <w:szCs w:val="28"/>
+          <w:lang w:eastAsia="ru-RU"/>
+        </w:rPr>
+        <w:br/>
+        <w:t xml:space="preserve">        type: "string"</w:t>
+      </w:r>
+      <w:r>
+        <w:rPr>
+          <w:rFonts w:ascii="Times New Roman" w:eastAsiaTheme="minorEastAsia" w:hAnsi="Times New Roman" w:hint="default"/>
+          <w:sz w:val="28"/>
+          <w:szCs w:val="28"/>
+          <w:lang w:eastAsia="ru-RU"/>
+        </w:rPr>
+        <w:br/>
+        <w:t xml:space="preserve">        </w:t>
+      </w:r>
+      <w:proofErr w:type="spellStart"/>
+      <w:r>
+        <w:rPr>
+          <w:rFonts w:ascii="Times New Roman" w:eastAsiaTheme="minorEastAsia" w:hAnsi="Times New Roman" w:hint="default"/>
+          <w:sz w:val="28"/>
+          <w:szCs w:val="28"/>
+          <w:lang w:eastAsia="ru-RU"/>
+        </w:rPr>
+        <w:t>enum</w:t>
+      </w:r>
+      <w:proofErr w:type="spellEnd"/>
+      <w:r>
+        <w:rPr>
+          <w:rFonts w:ascii="Times New Roman" w:eastAsiaTheme="minorEastAsia" w:hAnsi="Times New Roman" w:hint="default"/>
+          <w:sz w:val="28"/>
+          <w:szCs w:val="28"/>
+          <w:lang w:eastAsia="ru-RU"/>
+        </w:rPr>
+        <w:t>:</w:t>
+      </w:r>
+      <w:r>
+        <w:rPr>
+          <w:rFonts w:ascii="Times New Roman" w:eastAsiaTheme="minorEastAsia" w:hAnsi="Times New Roman" w:hint="default"/>
+          <w:sz w:val="28"/>
+          <w:szCs w:val="28"/>
+          <w:lang w:eastAsia="ru-RU"/>
+        </w:rPr>
+        <w:br/>
+        <w:t xml:space="preserve">        - "</w:t>
+      </w:r>
+      <w:r>
+        <w:rPr>
+          <w:rFonts w:ascii="Times New Roman" w:eastAsiaTheme="minorEastAsia" w:hAnsi="Times New Roman" w:hint="default"/>
+          <w:sz w:val="28"/>
+          <w:szCs w:val="28"/>
+          <w:lang w:val="ru-RU" w:eastAsia="ru-RU"/>
+        </w:rPr>
+        <w:t>Суп</w:t>
+      </w:r>
+      <w:r>
+        <w:rPr>
+          <w:rFonts w:ascii="Times New Roman" w:eastAsiaTheme="minorEastAsia" w:hAnsi="Times New Roman" w:hint="default"/>
+          <w:sz w:val="28"/>
+          <w:szCs w:val="28"/>
+          <w:lang w:eastAsia="ru-RU"/>
+        </w:rPr>
+        <w:t>"</w:t>
+      </w:r>
+      <w:r>
+        <w:rPr>
+          <w:rFonts w:ascii="Times New Roman" w:eastAsiaTheme="minorEastAsia" w:hAnsi="Times New Roman" w:hint="default"/>
+          <w:sz w:val="28"/>
+          <w:szCs w:val="28"/>
+          <w:lang w:eastAsia="ru-RU"/>
+        </w:rPr>
+        <w:br/>
+        <w:t xml:space="preserve">        - "</w:t>
+      </w:r>
+      <w:r>
+        <w:rPr>
+          <w:rFonts w:ascii="Times New Roman" w:eastAsiaTheme="minorEastAsia" w:hAnsi="Times New Roman" w:hint="default"/>
+          <w:sz w:val="28"/>
+          <w:szCs w:val="28"/>
+          <w:lang w:val="ru-RU" w:eastAsia="ru-RU"/>
+        </w:rPr>
+        <w:t>Второе</w:t>
+      </w:r>
+      <w:r>
+        <w:rPr>
+          <w:rFonts w:ascii="Times New Roman" w:eastAsiaTheme="minorEastAsia" w:hAnsi="Times New Roman" w:hint="default"/>
+          <w:sz w:val="28"/>
+          <w:szCs w:val="28"/>
+          <w:lang w:eastAsia="ru-RU"/>
+        </w:rPr>
+        <w:t>"</w:t>
+      </w:r>
+      <w:r>
+        <w:rPr>
+          <w:rFonts w:ascii="Times New Roman" w:eastAsiaTheme="minorEastAsia" w:hAnsi="Times New Roman" w:hint="default"/>
+          <w:sz w:val="28"/>
+          <w:szCs w:val="28"/>
+          <w:lang w:eastAsia="ru-RU"/>
+        </w:rPr>
+        <w:br/>
+        <w:t xml:space="preserve">        - "</w:t>
+      </w:r>
+      <w:r>
+        <w:rPr>
+          <w:rFonts w:ascii="Times New Roman" w:eastAsiaTheme="minorEastAsia" w:hAnsi="Times New Roman" w:hint="default"/>
+          <w:sz w:val="28"/>
+          <w:szCs w:val="28"/>
+          <w:lang w:val="ru-RU" w:eastAsia="ru-RU"/>
+        </w:rPr>
+        <w:t>Гарнир</w:t>
+      </w:r>
+      <w:r>
+        <w:rPr>
+          <w:rFonts w:ascii="Times New Roman" w:eastAsiaTheme="minorEastAsia" w:hAnsi="Times New Roman" w:hint="default"/>
+          <w:sz w:val="28"/>
+          <w:szCs w:val="28"/>
+          <w:lang w:eastAsia="ru-RU"/>
+        </w:rPr>
+        <w:t>"</w:t>
+      </w:r>
+      <w:r>
+        <w:rPr>
+          <w:rFonts w:ascii="Times New Roman" w:eastAsiaTheme="minorEastAsia" w:hAnsi="Times New Roman" w:hint="default"/>
+          <w:sz w:val="28"/>
+          <w:szCs w:val="28"/>
+          <w:lang w:eastAsia="ru-RU"/>
+        </w:rPr>
+        <w:br/>
+        <w:t xml:space="preserve">        - "</w:t>
+      </w:r>
+      <w:r>
+        <w:rPr>
+          <w:rFonts w:ascii="Times New Roman" w:eastAsiaTheme="minorEastAsia" w:hAnsi="Times New Roman" w:hint="default"/>
+          <w:sz w:val="28"/>
+          <w:szCs w:val="28"/>
+          <w:lang w:val="ru-RU" w:eastAsia="ru-RU"/>
+        </w:rPr>
+        <w:t>Завтрак</w:t>
+      </w:r>
+      <w:r>
+        <w:rPr>
+          <w:rFonts w:ascii="Times New Roman" w:eastAsiaTheme="minorEastAsia" w:hAnsi="Times New Roman" w:hint="default"/>
+          <w:sz w:val="28"/>
+          <w:szCs w:val="28"/>
+          <w:lang w:eastAsia="ru-RU"/>
+        </w:rPr>
+        <w:t>"</w:t>
+      </w:r>
+      <w:r>
+        <w:rPr>
+          <w:rFonts w:ascii="Times New Roman" w:eastAsiaTheme="minorEastAsia" w:hAnsi="Times New Roman" w:hint="default"/>
+          <w:sz w:val="28"/>
+          <w:szCs w:val="28"/>
+          <w:lang w:eastAsia="ru-RU"/>
+        </w:rPr>
+        <w:br/>
+        <w:t xml:space="preserve">        - "</w:t>
+      </w:r>
+      <w:r>
+        <w:rPr>
+          <w:rFonts w:ascii="Times New Roman" w:eastAsiaTheme="minorEastAsia" w:hAnsi="Times New Roman" w:hint="default"/>
+          <w:sz w:val="28"/>
+          <w:szCs w:val="28"/>
+          <w:lang w:val="ru-RU" w:eastAsia="ru-RU"/>
+        </w:rPr>
+        <w:t>Десерт</w:t>
+      </w:r>
+      <w:r>
+        <w:rPr>
+          <w:rFonts w:ascii="Times New Roman" w:eastAsiaTheme="minorEastAsia" w:hAnsi="Times New Roman" w:hint="default"/>
+          <w:sz w:val="28"/>
+          <w:szCs w:val="28"/>
+          <w:lang w:eastAsia="ru-RU"/>
+        </w:rPr>
+        <w:t>"</w:t>
+      </w:r>
+      <w:r>
+        <w:rPr>
+          <w:rFonts w:ascii="Times New Roman" w:eastAsiaTheme="minorEastAsia" w:hAnsi="Times New Roman" w:hint="default"/>
+          <w:sz w:val="28"/>
+          <w:szCs w:val="28"/>
+          <w:lang w:eastAsia="ru-RU"/>
+        </w:rPr>
+        <w:br/>
+        <w:t xml:space="preserve">        - "</w:t>
+      </w:r>
+      <w:r>
+        <w:rPr>
+          <w:rFonts w:ascii="Times New Roman" w:eastAsiaTheme="minorEastAsia" w:hAnsi="Times New Roman" w:hint="default"/>
+          <w:sz w:val="28"/>
+          <w:szCs w:val="28"/>
+          <w:lang w:val="ru-RU" w:eastAsia="ru-RU"/>
+        </w:rPr>
+        <w:t>Напиток</w:t>
+      </w:r>
+      <w:r>
+        <w:rPr>
+          <w:rFonts w:ascii="Times New Roman" w:eastAsiaTheme="minorEastAsia" w:hAnsi="Times New Roman" w:hint="default"/>
+          <w:sz w:val="28"/>
+          <w:szCs w:val="28"/>
+          <w:lang w:eastAsia="ru-RU"/>
+        </w:rPr>
+        <w:t>"</w:t>
+      </w:r>
+      <w:r>
+        <w:rPr>
+          <w:rFonts w:ascii="Times New Roman" w:eastAsiaTheme="minorEastAsia" w:hAnsi="Times New Roman" w:hint="default"/>
+          <w:sz w:val="28"/>
+          <w:szCs w:val="28"/>
+          <w:lang w:eastAsia="ru-RU"/>
+        </w:rPr>
+        <w:br/>
+        <w:t xml:space="preserve">        - "</w:t>
+      </w:r>
+      <w:r>
+        <w:rPr>
+          <w:rFonts w:ascii="Times New Roman" w:eastAsiaTheme="minorEastAsia" w:hAnsi="Times New Roman" w:hint="default"/>
+          <w:sz w:val="28"/>
+          <w:szCs w:val="28"/>
+          <w:lang w:val="ru-RU" w:eastAsia="ru-RU"/>
+        </w:rPr>
+        <w:t>Выпечка</w:t>
+      </w:r>
+      <w:r>
+        <w:rPr>
+          <w:rFonts w:ascii="Times New Roman" w:eastAsiaTheme="minorEastAsia" w:hAnsi="Times New Roman" w:hint="default"/>
+          <w:sz w:val="28"/>
+          <w:szCs w:val="28"/>
+          <w:lang w:eastAsia="ru-RU"/>
+        </w:rPr>
+        <w:t>"</w:t>
+      </w:r>
+      <w:r>
+        <w:rPr>
+          <w:rFonts w:ascii="Times New Roman" w:eastAsiaTheme="minorEastAsia" w:hAnsi="Times New Roman" w:hint="default"/>
+          <w:sz w:val="28"/>
+          <w:szCs w:val="28"/>
+          <w:lang w:eastAsia="ru-RU"/>
+        </w:rPr>
+        <w:br/>
+        <w:t xml:space="preserve">    - name: "</w:t>
+      </w:r>
+      <w:proofErr w:type="spellStart"/>
+      <w:r>
+        <w:rPr>
+          <w:rFonts w:ascii="Times New Roman" w:eastAsiaTheme="minorEastAsia" w:hAnsi="Times New Roman" w:hint="default"/>
+          <w:sz w:val="28"/>
+          <w:szCs w:val="28"/>
+          <w:lang w:eastAsia="ru-RU"/>
+        </w:rPr>
+        <w:t>productCategory</w:t>
+      </w:r>
+      <w:proofErr w:type="spellEnd"/>
+      <w:r>
+        <w:rPr>
+          <w:rFonts w:ascii="Times New Roman" w:eastAsiaTheme="minorEastAsia" w:hAnsi="Times New Roman" w:hint="default"/>
+          <w:sz w:val="28"/>
+          <w:szCs w:val="28"/>
+          <w:lang w:eastAsia="ru-RU"/>
+        </w:rPr>
+        <w:t>"</w:t>
+      </w:r>
+      <w:r>
+        <w:rPr>
+          <w:rFonts w:ascii="Times New Roman" w:eastAsiaTheme="minorEastAsia" w:hAnsi="Times New Roman" w:hint="default"/>
+          <w:sz w:val="28"/>
+          <w:szCs w:val="28"/>
+          <w:lang w:eastAsia="ru-RU"/>
+        </w:rPr>
+        <w:br/>
       </w:r>
       <w:r>
         <w:rPr>
@@ -3165,392 +5165,6 @@
           <w:lang w:eastAsia="ru-RU"/>
         </w:rPr>
         <w:lastRenderedPageBreak/>
-        <w:t xml:space="preserve">    </w:t>
-      </w:r>
-      <w:proofErr w:type="spellStart"/>
-      <w:r>
-        <w:rPr>
-          <w:rFonts w:ascii="Times New Roman" w:eastAsiaTheme="minorEastAsia" w:hAnsi="Times New Roman" w:hint="default"/>
-          <w:sz w:val="28"/>
-          <w:szCs w:val="28"/>
-          <w:lang w:eastAsia="ru-RU"/>
-        </w:rPr>
-        <w:t>operationId</w:t>
-      </w:r>
-      <w:proofErr w:type="spellEnd"/>
-      <w:r>
-        <w:rPr>
-          <w:rFonts w:ascii="Times New Roman" w:eastAsiaTheme="minorEastAsia" w:hAnsi="Times New Roman" w:hint="default"/>
-          <w:sz w:val="28"/>
-          <w:szCs w:val="28"/>
-          <w:lang w:eastAsia="ru-RU"/>
-        </w:rPr>
-        <w:t>: "</w:t>
-      </w:r>
-      <w:proofErr w:type="spellStart"/>
-      <w:r>
-        <w:rPr>
-          <w:rFonts w:ascii="Times New Roman" w:eastAsiaTheme="minorEastAsia" w:hAnsi="Times New Roman" w:hint="default"/>
-          <w:sz w:val="28"/>
-          <w:szCs w:val="28"/>
-          <w:lang w:eastAsia="ru-RU"/>
-        </w:rPr>
-        <w:t>getRecipesForCurrentUser</w:t>
-      </w:r>
-      <w:proofErr w:type="spellEnd"/>
-      <w:r>
-        <w:rPr>
-          <w:rFonts w:ascii="Times New Roman" w:eastAsiaTheme="minorEastAsia" w:hAnsi="Times New Roman" w:hint="default"/>
-          <w:sz w:val="28"/>
-          <w:szCs w:val="28"/>
-          <w:lang w:eastAsia="ru-RU"/>
-        </w:rPr>
-        <w:t>"</w:t>
-      </w:r>
-      <w:r>
-        <w:rPr>
-          <w:rFonts w:ascii="Times New Roman" w:eastAsiaTheme="minorEastAsia" w:hAnsi="Times New Roman" w:hint="default"/>
-          <w:sz w:val="28"/>
-          <w:szCs w:val="28"/>
-          <w:lang w:eastAsia="ru-RU"/>
-        </w:rPr>
-        <w:br/>
-        <w:t xml:space="preserve">    parameters:</w:t>
-      </w:r>
-      <w:r>
-        <w:rPr>
-          <w:rFonts w:ascii="Times New Roman" w:eastAsiaTheme="minorEastAsia" w:hAnsi="Times New Roman" w:hint="default"/>
-          <w:sz w:val="28"/>
-          <w:szCs w:val="28"/>
-          <w:lang w:eastAsia="ru-RU"/>
-        </w:rPr>
-        <w:br/>
-        <w:t xml:space="preserve">    - name: "</w:t>
-      </w:r>
-      <w:proofErr w:type="spellStart"/>
-      <w:r>
-        <w:rPr>
-          <w:rFonts w:ascii="Times New Roman" w:eastAsiaTheme="minorEastAsia" w:hAnsi="Times New Roman" w:hint="default"/>
-          <w:sz w:val="28"/>
-          <w:szCs w:val="28"/>
-          <w:lang w:eastAsia="ru-RU"/>
-        </w:rPr>
-        <w:t>recipeCategory</w:t>
-      </w:r>
-      <w:proofErr w:type="spellEnd"/>
-      <w:r>
-        <w:rPr>
-          <w:rFonts w:ascii="Times New Roman" w:eastAsiaTheme="minorEastAsia" w:hAnsi="Times New Roman" w:hint="default"/>
-          <w:sz w:val="28"/>
-          <w:szCs w:val="28"/>
-          <w:lang w:eastAsia="ru-RU"/>
-        </w:rPr>
-        <w:t>"</w:t>
-      </w:r>
-      <w:r>
-        <w:rPr>
-          <w:rFonts w:ascii="Times New Roman" w:eastAsiaTheme="minorEastAsia" w:hAnsi="Times New Roman" w:hint="default"/>
-          <w:sz w:val="28"/>
-          <w:szCs w:val="28"/>
-          <w:lang w:eastAsia="ru-RU"/>
-        </w:rPr>
-        <w:br/>
-        <w:t xml:space="preserve">      in: "query"</w:t>
-      </w:r>
-      <w:r>
-        <w:rPr>
-          <w:rFonts w:ascii="Times New Roman" w:eastAsiaTheme="minorEastAsia" w:hAnsi="Times New Roman" w:hint="default"/>
-          <w:sz w:val="28"/>
-          <w:szCs w:val="28"/>
-          <w:lang w:eastAsia="ru-RU"/>
-        </w:rPr>
-        <w:br/>
-        <w:t xml:space="preserve">      required: false</w:t>
-      </w:r>
-      <w:r>
-        <w:rPr>
-          <w:rFonts w:ascii="Times New Roman" w:eastAsiaTheme="minorEastAsia" w:hAnsi="Times New Roman" w:hint="default"/>
-          <w:sz w:val="28"/>
-          <w:szCs w:val="28"/>
-          <w:lang w:eastAsia="ru-RU"/>
-        </w:rPr>
-        <w:br/>
-        <w:t xml:space="preserve">      schema:</w:t>
-      </w:r>
-      <w:r>
-        <w:rPr>
-          <w:rFonts w:ascii="Times New Roman" w:eastAsiaTheme="minorEastAsia" w:hAnsi="Times New Roman" w:hint="default"/>
-          <w:sz w:val="28"/>
-          <w:szCs w:val="28"/>
-          <w:lang w:eastAsia="ru-RU"/>
-        </w:rPr>
-        <w:br/>
-        <w:t xml:space="preserve">        type: "string"</w:t>
-      </w:r>
-      <w:r>
-        <w:rPr>
-          <w:rFonts w:ascii="Times New Roman" w:eastAsiaTheme="minorEastAsia" w:hAnsi="Times New Roman" w:hint="default"/>
-          <w:sz w:val="28"/>
-          <w:szCs w:val="28"/>
-          <w:lang w:eastAsia="ru-RU"/>
-        </w:rPr>
-        <w:br/>
-        <w:t xml:space="preserve">        </w:t>
-      </w:r>
-      <w:proofErr w:type="spellStart"/>
-      <w:r>
-        <w:rPr>
-          <w:rFonts w:ascii="Times New Roman" w:eastAsiaTheme="minorEastAsia" w:hAnsi="Times New Roman" w:hint="default"/>
-          <w:sz w:val="28"/>
-          <w:szCs w:val="28"/>
-          <w:lang w:eastAsia="ru-RU"/>
-        </w:rPr>
-        <w:t>enum</w:t>
-      </w:r>
-      <w:proofErr w:type="spellEnd"/>
-      <w:r>
-        <w:rPr>
-          <w:rFonts w:ascii="Times New Roman" w:eastAsiaTheme="minorEastAsia" w:hAnsi="Times New Roman" w:hint="default"/>
-          <w:sz w:val="28"/>
-          <w:szCs w:val="28"/>
-          <w:lang w:eastAsia="ru-RU"/>
-        </w:rPr>
-        <w:t>:</w:t>
-      </w:r>
-      <w:r>
-        <w:rPr>
-          <w:rFonts w:ascii="Times New Roman" w:eastAsiaTheme="minorEastAsia" w:hAnsi="Times New Roman" w:hint="default"/>
-          <w:sz w:val="28"/>
-          <w:szCs w:val="28"/>
-          <w:lang w:eastAsia="ru-RU"/>
-        </w:rPr>
-        <w:br/>
-        <w:t xml:space="preserve">        - "</w:t>
-      </w:r>
-      <w:r>
-        <w:rPr>
-          <w:rFonts w:ascii="Times New Roman" w:eastAsiaTheme="minorEastAsia" w:hAnsi="Times New Roman" w:hint="default"/>
-          <w:sz w:val="28"/>
-          <w:szCs w:val="28"/>
-          <w:lang w:val="ru-RU" w:eastAsia="ru-RU"/>
-        </w:rPr>
-        <w:t>Суп</w:t>
-      </w:r>
-      <w:r>
-        <w:rPr>
-          <w:rFonts w:ascii="Times New Roman" w:eastAsiaTheme="minorEastAsia" w:hAnsi="Times New Roman" w:hint="default"/>
-          <w:sz w:val="28"/>
-          <w:szCs w:val="28"/>
-          <w:lang w:eastAsia="ru-RU"/>
-        </w:rPr>
-        <w:t>"</w:t>
-      </w:r>
-      <w:r>
-        <w:rPr>
-          <w:rFonts w:ascii="Times New Roman" w:eastAsiaTheme="minorEastAsia" w:hAnsi="Times New Roman" w:hint="default"/>
-          <w:sz w:val="28"/>
-          <w:szCs w:val="28"/>
-          <w:lang w:eastAsia="ru-RU"/>
-        </w:rPr>
-        <w:br/>
-        <w:t xml:space="preserve">        - "</w:t>
-      </w:r>
-      <w:r>
-        <w:rPr>
-          <w:rFonts w:ascii="Times New Roman" w:eastAsiaTheme="minorEastAsia" w:hAnsi="Times New Roman" w:hint="default"/>
-          <w:sz w:val="28"/>
-          <w:szCs w:val="28"/>
-          <w:lang w:val="ru-RU" w:eastAsia="ru-RU"/>
-        </w:rPr>
-        <w:t>Второе</w:t>
-      </w:r>
-      <w:r>
-        <w:rPr>
-          <w:rFonts w:ascii="Times New Roman" w:eastAsiaTheme="minorEastAsia" w:hAnsi="Times New Roman" w:hint="default"/>
-          <w:sz w:val="28"/>
-          <w:szCs w:val="28"/>
-          <w:lang w:eastAsia="ru-RU"/>
-        </w:rPr>
-        <w:t>"</w:t>
-      </w:r>
-      <w:r>
-        <w:rPr>
-          <w:rFonts w:ascii="Times New Roman" w:eastAsiaTheme="minorEastAsia" w:hAnsi="Times New Roman" w:hint="default"/>
-          <w:sz w:val="28"/>
-          <w:szCs w:val="28"/>
-          <w:lang w:eastAsia="ru-RU"/>
-        </w:rPr>
-        <w:br/>
-        <w:t xml:space="preserve">        - "</w:t>
-      </w:r>
-      <w:r>
-        <w:rPr>
-          <w:rFonts w:ascii="Times New Roman" w:eastAsiaTheme="minorEastAsia" w:hAnsi="Times New Roman" w:hint="default"/>
-          <w:sz w:val="28"/>
-          <w:szCs w:val="28"/>
-          <w:lang w:val="ru-RU" w:eastAsia="ru-RU"/>
-        </w:rPr>
-        <w:t>Гарнир</w:t>
-      </w:r>
-      <w:r>
-        <w:rPr>
-          <w:rFonts w:ascii="Times New Roman" w:eastAsiaTheme="minorEastAsia" w:hAnsi="Times New Roman" w:hint="default"/>
-          <w:sz w:val="28"/>
-          <w:szCs w:val="28"/>
-          <w:lang w:eastAsia="ru-RU"/>
-        </w:rPr>
-        <w:t>"</w:t>
-      </w:r>
-      <w:r>
-        <w:rPr>
-          <w:rFonts w:ascii="Times New Roman" w:eastAsiaTheme="minorEastAsia" w:hAnsi="Times New Roman" w:hint="default"/>
-          <w:sz w:val="28"/>
-          <w:szCs w:val="28"/>
-          <w:lang w:eastAsia="ru-RU"/>
-        </w:rPr>
-        <w:br/>
-        <w:t xml:space="preserve">        - "</w:t>
-      </w:r>
-      <w:r>
-        <w:rPr>
-          <w:rFonts w:ascii="Times New Roman" w:eastAsiaTheme="minorEastAsia" w:hAnsi="Times New Roman" w:hint="default"/>
-          <w:sz w:val="28"/>
-          <w:szCs w:val="28"/>
-          <w:lang w:val="ru-RU" w:eastAsia="ru-RU"/>
-        </w:rPr>
-        <w:t>Завтрак</w:t>
-      </w:r>
-      <w:r>
-        <w:rPr>
-          <w:rFonts w:ascii="Times New Roman" w:eastAsiaTheme="minorEastAsia" w:hAnsi="Times New Roman" w:hint="default"/>
-          <w:sz w:val="28"/>
-          <w:szCs w:val="28"/>
-          <w:lang w:eastAsia="ru-RU"/>
-        </w:rPr>
-        <w:t>"</w:t>
-      </w:r>
-      <w:r>
-        <w:rPr>
-          <w:rFonts w:ascii="Times New Roman" w:eastAsiaTheme="minorEastAsia" w:hAnsi="Times New Roman" w:hint="default"/>
-          <w:sz w:val="28"/>
-          <w:szCs w:val="28"/>
-          <w:lang w:eastAsia="ru-RU"/>
-        </w:rPr>
-        <w:br/>
-        <w:t xml:space="preserve">        - "</w:t>
-      </w:r>
-      <w:r>
-        <w:rPr>
-          <w:rFonts w:ascii="Times New Roman" w:eastAsiaTheme="minorEastAsia" w:hAnsi="Times New Roman" w:hint="default"/>
-          <w:sz w:val="28"/>
-          <w:szCs w:val="28"/>
-          <w:lang w:val="ru-RU" w:eastAsia="ru-RU"/>
-        </w:rPr>
-        <w:t>Десерт</w:t>
-      </w:r>
-      <w:r>
-        <w:rPr>
-          <w:rFonts w:ascii="Times New Roman" w:eastAsiaTheme="minorEastAsia" w:hAnsi="Times New Roman" w:hint="default"/>
-          <w:sz w:val="28"/>
-          <w:szCs w:val="28"/>
-          <w:lang w:eastAsia="ru-RU"/>
-        </w:rPr>
-        <w:t>"</w:t>
-      </w:r>
-      <w:r>
-        <w:rPr>
-          <w:rFonts w:ascii="Times New Roman" w:eastAsiaTheme="minorEastAsia" w:hAnsi="Times New Roman" w:hint="default"/>
-          <w:sz w:val="28"/>
-          <w:szCs w:val="28"/>
-          <w:lang w:eastAsia="ru-RU"/>
-        </w:rPr>
-        <w:br/>
-        <w:t xml:space="preserve">        - "</w:t>
-      </w:r>
-      <w:r>
-        <w:rPr>
-          <w:rFonts w:ascii="Times New Roman" w:eastAsiaTheme="minorEastAsia" w:hAnsi="Times New Roman" w:hint="default"/>
-          <w:sz w:val="28"/>
-          <w:szCs w:val="28"/>
-          <w:lang w:val="ru-RU" w:eastAsia="ru-RU"/>
-        </w:rPr>
-        <w:t>Напиток</w:t>
-      </w:r>
-      <w:r>
-        <w:rPr>
-          <w:rFonts w:ascii="Times New Roman" w:eastAsiaTheme="minorEastAsia" w:hAnsi="Times New Roman" w:hint="default"/>
-          <w:sz w:val="28"/>
-          <w:szCs w:val="28"/>
-          <w:lang w:eastAsia="ru-RU"/>
-        </w:rPr>
-        <w:t>"</w:t>
-      </w:r>
-      <w:r>
-        <w:rPr>
-          <w:rFonts w:ascii="Times New Roman" w:eastAsiaTheme="minorEastAsia" w:hAnsi="Times New Roman" w:hint="default"/>
-          <w:sz w:val="28"/>
-          <w:szCs w:val="28"/>
-          <w:lang w:eastAsia="ru-RU"/>
-        </w:rPr>
-        <w:br/>
-        <w:t xml:space="preserve">        - "</w:t>
-      </w:r>
-      <w:r>
-        <w:rPr>
-          <w:rFonts w:ascii="Times New Roman" w:eastAsiaTheme="minorEastAsia" w:hAnsi="Times New Roman" w:hint="default"/>
-          <w:sz w:val="28"/>
-          <w:szCs w:val="28"/>
-          <w:lang w:val="ru-RU" w:eastAsia="ru-RU"/>
-        </w:rPr>
-        <w:t>Выпечка</w:t>
-      </w:r>
-      <w:r>
-        <w:rPr>
-          <w:rFonts w:ascii="Times New Roman" w:eastAsiaTheme="minorEastAsia" w:hAnsi="Times New Roman" w:hint="default"/>
-          <w:sz w:val="28"/>
-          <w:szCs w:val="28"/>
-          <w:lang w:eastAsia="ru-RU"/>
-        </w:rPr>
-        <w:t>"</w:t>
-      </w:r>
-      <w:r>
-        <w:rPr>
-          <w:rFonts w:ascii="Times New Roman" w:eastAsiaTheme="minorEastAsia" w:hAnsi="Times New Roman" w:hint="default"/>
-          <w:sz w:val="28"/>
-          <w:szCs w:val="28"/>
-          <w:lang w:eastAsia="ru-RU"/>
-        </w:rPr>
-        <w:br/>
-        <w:t xml:space="preserve">    - name: "</w:t>
-      </w:r>
-      <w:proofErr w:type="spellStart"/>
-      <w:r>
-        <w:rPr>
-          <w:rFonts w:ascii="Times New Roman" w:eastAsiaTheme="minorEastAsia" w:hAnsi="Times New Roman" w:hint="default"/>
-          <w:sz w:val="28"/>
-          <w:szCs w:val="28"/>
-          <w:lang w:eastAsia="ru-RU"/>
-        </w:rPr>
-        <w:t>productCategory</w:t>
-      </w:r>
-      <w:proofErr w:type="spellEnd"/>
-      <w:r>
-        <w:rPr>
-          <w:rFonts w:ascii="Times New Roman" w:eastAsiaTheme="minorEastAsia" w:hAnsi="Times New Roman" w:hint="default"/>
-          <w:sz w:val="28"/>
-          <w:szCs w:val="28"/>
-          <w:lang w:eastAsia="ru-RU"/>
-        </w:rPr>
-        <w:t>"</w:t>
-      </w:r>
-      <w:r>
-        <w:rPr>
-          <w:rFonts w:ascii="Times New Roman" w:eastAsiaTheme="minorEastAsia" w:hAnsi="Times New Roman" w:hint="default"/>
-          <w:sz w:val="28"/>
-          <w:szCs w:val="28"/>
-          <w:lang w:eastAsia="ru-RU"/>
-        </w:rPr>
-        <w:br/>
         <w:t xml:space="preserve">      in: "query"</w:t>
       </w:r>
       <w:r>
@@ -4201,6 +5815,15 @@
           <w:lang w:eastAsia="ru-RU"/>
         </w:rPr>
         <w:br/>
+      </w:r>
+      <w:r>
+        <w:rPr>
+          <w:rFonts w:ascii="Times New Roman" w:eastAsiaTheme="minorEastAsia" w:hAnsi="Times New Roman" w:hint="default"/>
+          <w:sz w:val="28"/>
+          <w:szCs w:val="28"/>
+          <w:lang w:eastAsia="ru-RU"/>
+        </w:rPr>
+        <w:lastRenderedPageBreak/>
         <w:t xml:space="preserve">    </w:t>
       </w:r>
       <w:proofErr w:type="spellStart"/>
@@ -4712,7 +6335,6 @@
           <w:szCs w:val="28"/>
           <w:lang w:eastAsia="ru-RU"/>
         </w:rPr>
-        <w:lastRenderedPageBreak/>
         <w:t xml:space="preserve">      schema:</w:t>
       </w:r>
       <w:r>
@@ -4896,6 +6518,7 @@
           <w:szCs w:val="28"/>
           <w:lang w:eastAsia="ru-RU"/>
         </w:rPr>
+        <w:lastRenderedPageBreak/>
         <w:t>/</w:t>
       </w:r>
       <w:proofErr w:type="gramStart"/>
@@ -5380,15 +7003,6 @@
           <w:lang w:eastAsia="ru-RU"/>
         </w:rPr>
         <w:br/>
-      </w:r>
-      <w:r>
-        <w:rPr>
-          <w:rFonts w:ascii="Times New Roman" w:eastAsiaTheme="minorEastAsia" w:hAnsi="Times New Roman" w:hint="default"/>
-          <w:sz w:val="28"/>
-          <w:szCs w:val="28"/>
-          <w:lang w:eastAsia="ru-RU"/>
-        </w:rPr>
-        <w:lastRenderedPageBreak/>
         <w:t xml:space="preserve">        description: "OK"</w:t>
       </w:r>
       <w:r>
@@ -5616,6 +7230,15 @@
           <w:lang w:eastAsia="ru-RU"/>
         </w:rPr>
         <w:br/>
+      </w:r>
+      <w:r>
+        <w:rPr>
+          <w:rFonts w:ascii="Times New Roman" w:eastAsiaTheme="minorEastAsia" w:hAnsi="Times New Roman" w:hint="default"/>
+          <w:sz w:val="28"/>
+          <w:szCs w:val="28"/>
+          <w:lang w:eastAsia="ru-RU"/>
+        </w:rPr>
+        <w:lastRenderedPageBreak/>
         <w:t xml:space="preserve">            schema:</w:t>
       </w:r>
       <w:r>
@@ -6039,15 +7662,6 @@
           <w:lang w:eastAsia="ru-RU"/>
         </w:rPr>
         <w:br/>
-      </w:r>
-      <w:r>
-        <w:rPr>
-          <w:rFonts w:ascii="Times New Roman" w:eastAsiaTheme="minorEastAsia" w:hAnsi="Times New Roman" w:hint="default"/>
-          <w:sz w:val="28"/>
-          <w:szCs w:val="28"/>
-          <w:lang w:eastAsia="ru-RU"/>
-        </w:rPr>
-        <w:lastRenderedPageBreak/>
         <w:t xml:space="preserve">    </w:t>
       </w:r>
       <w:proofErr w:type="spellStart"/>
@@ -6261,6 +7875,7 @@
           <w:szCs w:val="28"/>
           <w:lang w:eastAsia="ru-RU"/>
         </w:rPr>
+        <w:lastRenderedPageBreak/>
         <w:t>/</w:t>
       </w:r>
       <w:proofErr w:type="spellStart"/>
@@ -6836,15 +8451,6 @@
           <w:lang w:eastAsia="ru-RU"/>
         </w:rPr>
         <w:br/>
-      </w:r>
-      <w:r>
-        <w:rPr>
-          <w:rFonts w:ascii="Times New Roman" w:eastAsiaTheme="minorEastAsia" w:hAnsi="Times New Roman" w:hint="default"/>
-          <w:sz w:val="28"/>
-          <w:szCs w:val="28"/>
-          <w:lang w:eastAsia="ru-RU"/>
-        </w:rPr>
-        <w:lastRenderedPageBreak/>
         <w:t xml:space="preserve">        content:</w:t>
       </w:r>
       <w:r>
@@ -7186,6 +8792,15 @@
           <w:lang w:eastAsia="ru-RU"/>
         </w:rPr>
         <w:br/>
+      </w:r>
+      <w:r>
+        <w:rPr>
+          <w:rFonts w:ascii="Times New Roman" w:eastAsiaTheme="minorEastAsia" w:hAnsi="Times New Roman" w:hint="default"/>
+          <w:sz w:val="28"/>
+          <w:szCs w:val="28"/>
+          <w:lang w:eastAsia="ru-RU"/>
+        </w:rPr>
+        <w:lastRenderedPageBreak/>
         <w:t xml:space="preserve">      required: true</w:t>
       </w:r>
       <w:r>
@@ -7336,7 +8951,6 @@
         <w:rPr>
           <w:noProof/>
         </w:rPr>
-        <w:lastRenderedPageBreak/>
         <w:drawing>
           <wp:inline distT="0" distB="0" distL="0" distR="0" wp14:anchorId="7AE8D35C" wp14:editId="51015BCB">
             <wp:extent cx="1760220" cy="2893695"/>
@@ -7390,6 +9004,9 @@
     <w:p>
       <w:pPr>
         <w:pStyle w:val="-"/>
+        <w:rPr>
+          <w:lang w:val="en-US"/>
+        </w:rPr>
       </w:pPr>
       <w:r>
         <w:t>Рисунок 5 – Схема взаимодействия компонентов приложения</w:t>
@@ -7397,12 +9014,190 @@
     </w:p>
     <w:p>
       <w:pPr>
+        <w:pStyle w:val="1-"/>
+      </w:pPr>
+      <w:r>
+        <w:t xml:space="preserve">Таким образом, в ходе выполнения лабораторных работ было разработано </w:t>
+      </w:r>
+      <w:r>
+        <w:rPr>
+          <w:lang w:val="en-US"/>
+        </w:rPr>
+        <w:t>Spring</w:t>
+      </w:r>
+      <w:r>
+        <w:t xml:space="preserve"> </w:t>
+      </w:r>
+      <w:r>
+        <w:rPr>
+          <w:lang w:val="en-US"/>
+        </w:rPr>
+        <w:t>Boot</w:t>
+      </w:r>
+      <w:r>
+        <w:t xml:space="preserve"> приложение «</w:t>
+      </w:r>
+      <w:r>
+        <w:rPr>
+          <w:lang w:val="en-US"/>
+        </w:rPr>
+        <w:t>Recipes</w:t>
+      </w:r>
+      <w:r>
+        <w:t xml:space="preserve"> </w:t>
+      </w:r>
+      <w:r>
+        <w:rPr>
+          <w:lang w:val="en-US"/>
+        </w:rPr>
+        <w:t>Helper</w:t>
+      </w:r>
+      <w:r>
+        <w:t>»</w:t>
+      </w:r>
+      <w:r>
+        <w:t xml:space="preserve">, </w:t>
+      </w:r>
+      <w:r>
+        <w:t xml:space="preserve">которое позволяет </w:t>
+      </w:r>
+      <w:r>
+        <w:lastRenderedPageBreak/>
+        <w:t xml:space="preserve">пользователю подбирать рецепты из каталога на основе имеющихся у него продуктов. При использовании приложения была использована база данных </w:t>
+      </w:r>
+      <w:r>
+        <w:rPr>
+          <w:lang w:val="en-US"/>
+        </w:rPr>
+        <w:t>PostgreSQL</w:t>
+      </w:r>
+      <w:r>
+        <w:t xml:space="preserve">, обращение к которой происходит с помощью </w:t>
+      </w:r>
+      <w:r>
+        <w:rPr>
+          <w:lang w:val="en-US"/>
+        </w:rPr>
+        <w:t>JPA</w:t>
+      </w:r>
+      <w:r>
+        <w:t xml:space="preserve">, </w:t>
+      </w:r>
+      <w:r>
+        <w:t xml:space="preserve">реализовано </w:t>
+      </w:r>
+      <w:r>
+        <w:rPr>
+          <w:lang w:val="en-US"/>
+        </w:rPr>
+        <w:t>RESTful</w:t>
+      </w:r>
+      <w:r>
+        <w:t xml:space="preserve"> </w:t>
+      </w:r>
+      <w:r>
+        <w:rPr>
+          <w:lang w:val="en-US"/>
+        </w:rPr>
+        <w:t>API</w:t>
+      </w:r>
+      <w:r>
+        <w:t xml:space="preserve">, </w:t>
+      </w:r>
+      <w:r>
+        <w:t xml:space="preserve">реализована авторизация и аутентификация с помощью сессий на основе </w:t>
+      </w:r>
+      <w:r>
+        <w:rPr>
+          <w:lang w:val="en-US"/>
+        </w:rPr>
+        <w:t>Spring</w:t>
+      </w:r>
+      <w:r>
+        <w:t xml:space="preserve"> </w:t>
+      </w:r>
+      <w:r>
+        <w:rPr>
+          <w:lang w:val="en-US"/>
+        </w:rPr>
+        <w:t>Security</w:t>
+      </w:r>
+      <w:r>
+        <w:t xml:space="preserve">, </w:t>
+      </w:r>
+      <w:r>
+        <w:t xml:space="preserve">а также с использованием </w:t>
+      </w:r>
+      <w:r>
+        <w:rPr>
+          <w:lang w:val="en-US"/>
+        </w:rPr>
+        <w:t>JWT</w:t>
+      </w:r>
+      <w:r>
+        <w:t xml:space="preserve">-токенов. Для </w:t>
+      </w:r>
+      <w:r>
+        <w:t xml:space="preserve">рендера </w:t>
+      </w:r>
+      <w:r>
+        <w:rPr>
+          <w:lang w:val="en-US"/>
+        </w:rPr>
+        <w:t>HTML</w:t>
+      </w:r>
+      <w:r>
+        <w:t>-</w:t>
+      </w:r>
+      <w:r>
+        <w:t xml:space="preserve">страниц используется </w:t>
+      </w:r>
+      <w:proofErr w:type="spellStart"/>
+      <w:r>
+        <w:t>шаблонизатор</w:t>
+      </w:r>
+      <w:proofErr w:type="spellEnd"/>
+      <w:r>
+        <w:t xml:space="preserve"> </w:t>
+      </w:r>
+      <w:proofErr w:type="spellStart"/>
+      <w:r>
+        <w:rPr>
+          <w:lang w:val="en-US"/>
+        </w:rPr>
+        <w:t>Thymeleaf</w:t>
+      </w:r>
+      <w:proofErr w:type="spellEnd"/>
+      <w:r>
+        <w:t xml:space="preserve">. </w:t>
+      </w:r>
+      <w:r>
+        <w:t xml:space="preserve">Также приложение было собрано и запущено в </w:t>
+      </w:r>
+      <w:r>
+        <w:rPr>
+          <w:lang w:val="en-US"/>
+        </w:rPr>
+        <w:t>docker</w:t>
+      </w:r>
+      <w:r>
+        <w:t>-</w:t>
+      </w:r>
+      <w:r>
+        <w:t xml:space="preserve">контейнерах. </w:t>
+      </w:r>
+      <w:r>
+        <w:t>Таким образом, поставленные задачи по разработке, контейнеризации и тестированию приложения выполнены в полном объёме. Полученный результат можно использовать как основу для дальнейшего развития проекта, масштабирования функционала и внедрения в реальную эксплуатацию.</w:t>
+      </w:r>
+    </w:p>
+    <w:p>
+      <w:pPr>
         <w:pStyle w:val="HTML0"/>
         <w:rPr>
           <w:rFonts w:ascii="Times New Roman" w:eastAsiaTheme="minorEastAsia" w:hAnsi="Times New Roman" w:hint="default"/>
           <w:sz w:val="28"/>
           <w:szCs w:val="28"/>
-          <w:lang w:eastAsia="ru-RU"/>
+          <w:lang w:val="ru-RU" w:eastAsia="ru-RU"/>
         </w:rPr>
       </w:pPr>
     </w:p>
@@ -8713,7 +10508,6 @@
   <w:style w:type="character" w:default="1" w:styleId="a1">
     <w:name w:val="Default Paragraph Font"/>
     <w:uiPriority w:val="1"/>
-    <w:semiHidden/>
     <w:unhideWhenUsed/>
   </w:style>
   <w:style w:type="table" w:default="1" w:styleId="a2">

</xml_diff>